<commit_message>
auth: alta automática de cuentas del dominio en el primer acceso (primera cuenta = ADMIN); manual y contrato actualizados
</commit_message>
<xml_diff>
--- a/docs/Manual_Usuario_SMLXL_Reuniones.docx
+++ b/docs/Manual_Usuario_SMLXL_Reuniones.docx
@@ -110,14 +110,13 @@
           <w:sz w:val="34"/>
           <w:szCs w:val="34"/>
         </w:rPr>
-        <w:lastRenderedPageBreak/>
         <w:t>Contenido</w:t>
       </w:r>
     </w:p>
     <w:sdt>
       <w:sdtPr>
         <w:alias w:val="Contenido"/>
-        <w:id w:val="392703143"/>
+        <w:id w:val="-1529473031"/>
       </w:sdtPr>
       <w:sdtEndPr/>
       <w:sdtContent>
@@ -145,7 +144,7 @@
           <w:r>
             <w:fldChar w:fldCharType="separate"/>
           </w:r>
-          <w:hyperlink w:anchor="_Toc239437890" w:history="1">
+          <w:hyperlink w:anchor="_Toc239441133" w:history="1">
             <w:r>
               <w:rPr>
                 <w:rStyle w:val="Hyperlink"/>
@@ -169,7 +168,7 @@
               <w:rPr>
                 <w:noProof/>
               </w:rPr>
-              <w:instrText xml:space="preserve"> PAGEREF _Toc239437890 \h </w:instrText>
+              <w:instrText xml:space="preserve"> PAGEREF _Toc239441133 \h </w:instrText>
             </w:r>
             <w:r>
               <w:rPr>
@@ -211,7 +210,7 @@
               <w14:ligatures w14:val="standardContextual"/>
             </w:rPr>
           </w:pPr>
-          <w:hyperlink w:anchor="_Toc239437891" w:history="1">
+          <w:hyperlink w:anchor="_Toc239441134" w:history="1">
             <w:r>
               <w:rPr>
                 <w:rStyle w:val="Hyperlink"/>
@@ -235,7 +234,7 @@
               <w:rPr>
                 <w:noProof/>
               </w:rPr>
-              <w:instrText xml:space="preserve"> PAGEREF _Toc239437891 \h </w:instrText>
+              <w:instrText xml:space="preserve"> PAGEREF _Toc239441134 \h </w:instrText>
             </w:r>
             <w:r>
               <w:rPr>
@@ -277,7 +276,7 @@
               <w14:ligatures w14:val="standardContextual"/>
             </w:rPr>
           </w:pPr>
-          <w:hyperlink w:anchor="_Toc239437892" w:history="1">
+          <w:hyperlink w:anchor="_Toc239441135" w:history="1">
             <w:r>
               <w:rPr>
                 <w:rStyle w:val="Hyperlink"/>
@@ -301,7 +300,7 @@
               <w:rPr>
                 <w:noProof/>
               </w:rPr>
-              <w:instrText xml:space="preserve"> PAGEREF _Toc239437892 \h </w:instrText>
+              <w:instrText xml:space="preserve"> PAGEREF _Toc239441135 \h </w:instrText>
             </w:r>
             <w:r>
               <w:rPr>
@@ -343,7 +342,7 @@
               <w14:ligatures w14:val="standardContextual"/>
             </w:rPr>
           </w:pPr>
-          <w:hyperlink w:anchor="_Toc239437893" w:history="1">
+          <w:hyperlink w:anchor="_Toc239441136" w:history="1">
             <w:r>
               <w:rPr>
                 <w:rStyle w:val="Hyperlink"/>
@@ -367,7 +366,7 @@
               <w:rPr>
                 <w:noProof/>
               </w:rPr>
-              <w:instrText xml:space="preserve"> PAGEREF _Toc239437893 \h </w:instrText>
+              <w:instrText xml:space="preserve"> PAGEREF _Toc239441136 \h </w:instrText>
             </w:r>
             <w:r>
               <w:rPr>
@@ -409,7 +408,7 @@
               <w14:ligatures w14:val="standardContextual"/>
             </w:rPr>
           </w:pPr>
-          <w:hyperlink w:anchor="_Toc239437894" w:history="1">
+          <w:hyperlink w:anchor="_Toc239441137" w:history="1">
             <w:r>
               <w:rPr>
                 <w:rStyle w:val="Hyperlink"/>
@@ -433,7 +432,7 @@
               <w:rPr>
                 <w:noProof/>
               </w:rPr>
-              <w:instrText xml:space="preserve"> PAGEREF _Toc239437894 \h </w:instrText>
+              <w:instrText xml:space="preserve"> PAGEREF _Toc239441137 \h </w:instrText>
             </w:r>
             <w:r>
               <w:rPr>
@@ -475,7 +474,7 @@
               <w14:ligatures w14:val="standardContextual"/>
             </w:rPr>
           </w:pPr>
-          <w:hyperlink w:anchor="_Toc239437895" w:history="1">
+          <w:hyperlink w:anchor="_Toc239441138" w:history="1">
             <w:r>
               <w:rPr>
                 <w:rStyle w:val="Hyperlink"/>
@@ -499,7 +498,7 @@
               <w:rPr>
                 <w:noProof/>
               </w:rPr>
-              <w:instrText xml:space="preserve"> PAGEREF _Toc239437895 \h </w:instrText>
+              <w:instrText xml:space="preserve"> PAGEREF _Toc239441138 \h </w:instrText>
             </w:r>
             <w:r>
               <w:rPr>
@@ -541,7 +540,7 @@
               <w14:ligatures w14:val="standardContextual"/>
             </w:rPr>
           </w:pPr>
-          <w:hyperlink w:anchor="_Toc239437896" w:history="1">
+          <w:hyperlink w:anchor="_Toc239441139" w:history="1">
             <w:r>
               <w:rPr>
                 <w:rStyle w:val="Hyperlink"/>
@@ -565,7 +564,7 @@
               <w:rPr>
                 <w:noProof/>
               </w:rPr>
-              <w:instrText xml:space="preserve"> PAGEREF _Toc239437896 \h </w:instrText>
+              <w:instrText xml:space="preserve"> PAGEREF _Toc239441139 \h </w:instrText>
             </w:r>
             <w:r>
               <w:rPr>
@@ -607,7 +606,7 @@
               <w14:ligatures w14:val="standardContextual"/>
             </w:rPr>
           </w:pPr>
-          <w:hyperlink w:anchor="_Toc239437897" w:history="1">
+          <w:hyperlink w:anchor="_Toc239441140" w:history="1">
             <w:r>
               <w:rPr>
                 <w:rStyle w:val="Hyperlink"/>
@@ -631,7 +630,7 @@
               <w:rPr>
                 <w:noProof/>
               </w:rPr>
-              <w:instrText xml:space="preserve"> PAGEREF _Toc239437897 \h </w:instrText>
+              <w:instrText xml:space="preserve"> PAGEREF _Toc239441140 \h </w:instrText>
             </w:r>
             <w:r>
               <w:rPr>
@@ -673,7 +672,7 @@
               <w14:ligatures w14:val="standardContextual"/>
             </w:rPr>
           </w:pPr>
-          <w:hyperlink w:anchor="_Toc239437898" w:history="1">
+          <w:hyperlink w:anchor="_Toc239441141" w:history="1">
             <w:r>
               <w:rPr>
                 <w:rStyle w:val="Hyperlink"/>
@@ -697,7 +696,7 @@
               <w:rPr>
                 <w:noProof/>
               </w:rPr>
-              <w:instrText xml:space="preserve"> PAGEREF _Toc239437898 \h </w:instrText>
+              <w:instrText xml:space="preserve"> PAGEREF _Toc239441141 \h </w:instrText>
             </w:r>
             <w:r>
               <w:rPr>
@@ -739,7 +738,7 @@
               <w14:ligatures w14:val="standardContextual"/>
             </w:rPr>
           </w:pPr>
-          <w:hyperlink w:anchor="_Toc239437899" w:history="1">
+          <w:hyperlink w:anchor="_Toc239441142" w:history="1">
             <w:r>
               <w:rPr>
                 <w:rStyle w:val="Hyperlink"/>
@@ -763,7 +762,7 @@
               <w:rPr>
                 <w:noProof/>
               </w:rPr>
-              <w:instrText xml:space="preserve"> PAGEREF _Toc239437899 \h </w:instrText>
+              <w:instrText xml:space="preserve"> PAGEREF _Toc239441142 \h </w:instrText>
             </w:r>
             <w:r>
               <w:rPr>
@@ -805,7 +804,7 @@
               <w14:ligatures w14:val="standardContextual"/>
             </w:rPr>
           </w:pPr>
-          <w:hyperlink w:anchor="_Toc239437900" w:history="1">
+          <w:hyperlink w:anchor="_Toc239441143" w:history="1">
             <w:r>
               <w:rPr>
                 <w:rStyle w:val="Hyperlink"/>
@@ -829,7 +828,7 @@
               <w:rPr>
                 <w:noProof/>
               </w:rPr>
-              <w:instrText xml:space="preserve"> PAGEREF _Toc239437900 \h </w:instrText>
+              <w:instrText xml:space="preserve"> PAGEREF _Toc239441143 \h </w:instrText>
             </w:r>
             <w:r>
               <w:rPr>
@@ -871,7 +870,7 @@
               <w14:ligatures w14:val="standardContextual"/>
             </w:rPr>
           </w:pPr>
-          <w:hyperlink w:anchor="_Toc239437901" w:history="1">
+          <w:hyperlink w:anchor="_Toc239441144" w:history="1">
             <w:r>
               <w:rPr>
                 <w:rStyle w:val="Hyperlink"/>
@@ -895,7 +894,7 @@
               <w:rPr>
                 <w:noProof/>
               </w:rPr>
-              <w:instrText xml:space="preserve"> PAGEREF _Toc239437901 \h </w:instrText>
+              <w:instrText xml:space="preserve"> PAGEREF _Toc239441144 \h </w:instrText>
             </w:r>
             <w:r>
               <w:rPr>
@@ -937,7 +936,7 @@
               <w14:ligatures w14:val="standardContextual"/>
             </w:rPr>
           </w:pPr>
-          <w:hyperlink w:anchor="_Toc239437902" w:history="1">
+          <w:hyperlink w:anchor="_Toc239441145" w:history="1">
             <w:r>
               <w:rPr>
                 <w:rStyle w:val="Hyperlink"/>
@@ -961,7 +960,7 @@
               <w:rPr>
                 <w:noProof/>
               </w:rPr>
-              <w:instrText xml:space="preserve"> PAGEREF _Toc239437902 \h </w:instrText>
+              <w:instrText xml:space="preserve"> PAGEREF _Toc239441145 \h </w:instrText>
             </w:r>
             <w:r>
               <w:rPr>
@@ -1003,7 +1002,7 @@
               <w14:ligatures w14:val="standardContextual"/>
             </w:rPr>
           </w:pPr>
-          <w:hyperlink w:anchor="_Toc239437903" w:history="1">
+          <w:hyperlink w:anchor="_Toc239441146" w:history="1">
             <w:r>
               <w:rPr>
                 <w:rStyle w:val="Hyperlink"/>
@@ -1027,7 +1026,7 @@
               <w:rPr>
                 <w:noProof/>
               </w:rPr>
-              <w:instrText xml:space="preserve"> PAGEREF _Toc239437903 \h </w:instrText>
+              <w:instrText xml:space="preserve"> PAGEREF _Toc239441146 \h </w:instrText>
             </w:r>
             <w:r>
               <w:rPr>
@@ -1069,7 +1068,7 @@
               <w14:ligatures w14:val="standardContextual"/>
             </w:rPr>
           </w:pPr>
-          <w:hyperlink w:anchor="_Toc239437904" w:history="1">
+          <w:hyperlink w:anchor="_Toc239441147" w:history="1">
             <w:r>
               <w:rPr>
                 <w:rStyle w:val="Hyperlink"/>
@@ -1093,7 +1092,7 @@
               <w:rPr>
                 <w:noProof/>
               </w:rPr>
-              <w:instrText xml:space="preserve"> PAGEREF _Toc239437904 \h </w:instrText>
+              <w:instrText xml:space="preserve"> PAGEREF _Toc239441147 \h </w:instrText>
             </w:r>
             <w:r>
               <w:rPr>
@@ -1135,7 +1134,7 @@
               <w14:ligatures w14:val="standardContextual"/>
             </w:rPr>
           </w:pPr>
-          <w:hyperlink w:anchor="_Toc239437905" w:history="1">
+          <w:hyperlink w:anchor="_Toc239441148" w:history="1">
             <w:r>
               <w:rPr>
                 <w:rStyle w:val="Hyperlink"/>
@@ -1159,7 +1158,7 @@
               <w:rPr>
                 <w:noProof/>
               </w:rPr>
-              <w:instrText xml:space="preserve"> PAGEREF _Toc239437905 \h </w:instrText>
+              <w:instrText xml:space="preserve"> PAGEREF _Toc239441148 \h </w:instrText>
             </w:r>
             <w:r>
               <w:rPr>
@@ -1201,7 +1200,7 @@
               <w14:ligatures w14:val="standardContextual"/>
             </w:rPr>
           </w:pPr>
-          <w:hyperlink w:anchor="_Toc239437906" w:history="1">
+          <w:hyperlink w:anchor="_Toc239441149" w:history="1">
             <w:r>
               <w:rPr>
                 <w:rStyle w:val="Hyperlink"/>
@@ -1225,7 +1224,7 @@
               <w:rPr>
                 <w:noProof/>
               </w:rPr>
-              <w:instrText xml:space="preserve"> PAGEREF _Toc239437906 \h </w:instrText>
+              <w:instrText xml:space="preserve"> PAGEREF _Toc239441149 \h </w:instrText>
             </w:r>
             <w:r>
               <w:rPr>
@@ -1267,7 +1266,7 @@
               <w14:ligatures w14:val="standardContextual"/>
             </w:rPr>
           </w:pPr>
-          <w:hyperlink w:anchor="_Toc239437907" w:history="1">
+          <w:hyperlink w:anchor="_Toc239441150" w:history="1">
             <w:r>
               <w:rPr>
                 <w:rStyle w:val="Hyperlink"/>
@@ -1291,7 +1290,7 @@
               <w:rPr>
                 <w:noProof/>
               </w:rPr>
-              <w:instrText xml:space="preserve"> PAGEREF _Toc239437907 \h </w:instrText>
+              <w:instrText xml:space="preserve"> PAGEREF _Toc239441150 \h </w:instrText>
             </w:r>
             <w:r>
               <w:rPr>
@@ -1333,7 +1332,7 @@
               <w14:ligatures w14:val="standardContextual"/>
             </w:rPr>
           </w:pPr>
-          <w:hyperlink w:anchor="_Toc239437908" w:history="1">
+          <w:hyperlink w:anchor="_Toc239441151" w:history="1">
             <w:r>
               <w:rPr>
                 <w:rStyle w:val="Hyperlink"/>
@@ -1357,7 +1356,7 @@
               <w:rPr>
                 <w:noProof/>
               </w:rPr>
-              <w:instrText xml:space="preserve"> PAGEREF _Toc239437908 \h </w:instrText>
+              <w:instrText xml:space="preserve"> PAGEREF _Toc239441151 \h </w:instrText>
             </w:r>
             <w:r>
               <w:rPr>
@@ -1399,7 +1398,7 @@
               <w14:ligatures w14:val="standardContextual"/>
             </w:rPr>
           </w:pPr>
-          <w:hyperlink w:anchor="_Toc239437909" w:history="1">
+          <w:hyperlink w:anchor="_Toc239441152" w:history="1">
             <w:r>
               <w:rPr>
                 <w:rStyle w:val="Hyperlink"/>
@@ -1423,7 +1422,7 @@
               <w:rPr>
                 <w:noProof/>
               </w:rPr>
-              <w:instrText xml:space="preserve"> PAGEREF _Toc239437909 \h </w:instrText>
+              <w:instrText xml:space="preserve"> PAGEREF _Toc239441152 \h </w:instrText>
             </w:r>
             <w:r>
               <w:rPr>
@@ -1465,7 +1464,7 @@
               <w14:ligatures w14:val="standardContextual"/>
             </w:rPr>
           </w:pPr>
-          <w:hyperlink w:anchor="_Toc239437910" w:history="1">
+          <w:hyperlink w:anchor="_Toc239441153" w:history="1">
             <w:r>
               <w:rPr>
                 <w:rStyle w:val="Hyperlink"/>
@@ -1489,7 +1488,7 @@
               <w:rPr>
                 <w:noProof/>
               </w:rPr>
-              <w:instrText xml:space="preserve"> PAGEREF _Toc239437910 \h </w:instrText>
+              <w:instrText xml:space="preserve"> PAGEREF _Toc239441153 \h </w:instrText>
             </w:r>
             <w:r>
               <w:rPr>
@@ -1531,7 +1530,7 @@
               <w14:ligatures w14:val="standardContextual"/>
             </w:rPr>
           </w:pPr>
-          <w:hyperlink w:anchor="_Toc239437911" w:history="1">
+          <w:hyperlink w:anchor="_Toc239441154" w:history="1">
             <w:r>
               <w:rPr>
                 <w:rStyle w:val="Hyperlink"/>
@@ -1555,7 +1554,7 @@
               <w:rPr>
                 <w:noProof/>
               </w:rPr>
-              <w:instrText xml:space="preserve"> PAGEREF _Toc239437911 \h </w:instrText>
+              <w:instrText xml:space="preserve"> PAGEREF _Toc239441154 \h </w:instrText>
             </w:r>
             <w:r>
               <w:rPr>
@@ -1597,7 +1596,7 @@
               <w14:ligatures w14:val="standardContextual"/>
             </w:rPr>
           </w:pPr>
-          <w:hyperlink w:anchor="_Toc239437912" w:history="1">
+          <w:hyperlink w:anchor="_Toc239441155" w:history="1">
             <w:r>
               <w:rPr>
                 <w:rStyle w:val="Hyperlink"/>
@@ -1621,7 +1620,7 @@
               <w:rPr>
                 <w:noProof/>
               </w:rPr>
-              <w:instrText xml:space="preserve"> PAGEREF _Toc239437912 \h </w:instrText>
+              <w:instrText xml:space="preserve"> PAGEREF _Toc239441155 \h </w:instrText>
             </w:r>
             <w:r>
               <w:rPr>
@@ -1663,7 +1662,7 @@
               <w14:ligatures w14:val="standardContextual"/>
             </w:rPr>
           </w:pPr>
-          <w:hyperlink w:anchor="_Toc239437913" w:history="1">
+          <w:hyperlink w:anchor="_Toc239441156" w:history="1">
             <w:r>
               <w:rPr>
                 <w:rStyle w:val="Hyperlink"/>
@@ -1687,7 +1686,7 @@
               <w:rPr>
                 <w:noProof/>
               </w:rPr>
-              <w:instrText xml:space="preserve"> PAGEREF _Toc239437913 \h </w:instrText>
+              <w:instrText xml:space="preserve"> PAGEREF _Toc239441156 \h </w:instrText>
             </w:r>
             <w:r>
               <w:rPr>
@@ -1729,7 +1728,7 @@
               <w14:ligatures w14:val="standardContextual"/>
             </w:rPr>
           </w:pPr>
-          <w:hyperlink w:anchor="_Toc239437914" w:history="1">
+          <w:hyperlink w:anchor="_Toc239441157" w:history="1">
             <w:r>
               <w:rPr>
                 <w:rStyle w:val="Hyperlink"/>
@@ -1753,7 +1752,7 @@
               <w:rPr>
                 <w:noProof/>
               </w:rPr>
-              <w:instrText xml:space="preserve"> PAGEREF _Toc239437914 \h </w:instrText>
+              <w:instrText xml:space="preserve"> PAGEREF _Toc239441157 \h </w:instrText>
             </w:r>
             <w:r>
               <w:rPr>
@@ -1795,7 +1794,7 @@
               <w14:ligatures w14:val="standardContextual"/>
             </w:rPr>
           </w:pPr>
-          <w:hyperlink w:anchor="_Toc239437915" w:history="1">
+          <w:hyperlink w:anchor="_Toc239441158" w:history="1">
             <w:r>
               <w:rPr>
                 <w:rStyle w:val="Hyperlink"/>
@@ -1819,7 +1818,7 @@
               <w:rPr>
                 <w:noProof/>
               </w:rPr>
-              <w:instrText xml:space="preserve"> PAGEREF _Toc239437915 \h </w:instrText>
+              <w:instrText xml:space="preserve"> PAGEREF _Toc239441158 \h </w:instrText>
             </w:r>
             <w:r>
               <w:rPr>
@@ -1861,7 +1860,7 @@
               <w14:ligatures w14:val="standardContextual"/>
             </w:rPr>
           </w:pPr>
-          <w:hyperlink w:anchor="_Toc239437916" w:history="1">
+          <w:hyperlink w:anchor="_Toc239441159" w:history="1">
             <w:r>
               <w:rPr>
                 <w:rStyle w:val="Hyperlink"/>
@@ -1885,7 +1884,7 @@
               <w:rPr>
                 <w:noProof/>
               </w:rPr>
-              <w:instrText xml:space="preserve"> PAGEREF _Toc239437916 \h </w:instrText>
+              <w:instrText xml:space="preserve"> PAGEREF _Toc239441159 \h </w:instrText>
             </w:r>
             <w:r>
               <w:rPr>
@@ -1927,7 +1926,7 @@
               <w14:ligatures w14:val="standardContextual"/>
             </w:rPr>
           </w:pPr>
-          <w:hyperlink w:anchor="_Toc239437917" w:history="1">
+          <w:hyperlink w:anchor="_Toc239441160" w:history="1">
             <w:r>
               <w:rPr>
                 <w:rStyle w:val="Hyperlink"/>
@@ -1951,7 +1950,7 @@
               <w:rPr>
                 <w:noProof/>
               </w:rPr>
-              <w:instrText xml:space="preserve"> PAGEREF _Toc239437917 \h </w:instrText>
+              <w:instrText xml:space="preserve"> PAGEREF _Toc239441160 \h </w:instrText>
             </w:r>
             <w:r>
               <w:rPr>
@@ -1993,7 +1992,7 @@
               <w14:ligatures w14:val="standardContextual"/>
             </w:rPr>
           </w:pPr>
-          <w:hyperlink w:anchor="_Toc239437918" w:history="1">
+          <w:hyperlink w:anchor="_Toc239441161" w:history="1">
             <w:r>
               <w:rPr>
                 <w:rStyle w:val="Hyperlink"/>
@@ -2017,7 +2016,7 @@
               <w:rPr>
                 <w:noProof/>
               </w:rPr>
-              <w:instrText xml:space="preserve"> PAGEREF _Toc239437918 \h </w:instrText>
+              <w:instrText xml:space="preserve"> PAGEREF _Toc239441161 \h </w:instrText>
             </w:r>
             <w:r>
               <w:rPr>
@@ -2059,7 +2058,7 @@
               <w14:ligatures w14:val="standardContextual"/>
             </w:rPr>
           </w:pPr>
-          <w:hyperlink w:anchor="_Toc239437919" w:history="1">
+          <w:hyperlink w:anchor="_Toc239441162" w:history="1">
             <w:r>
               <w:rPr>
                 <w:rStyle w:val="Hyperlink"/>
@@ -2083,7 +2082,7 @@
               <w:rPr>
                 <w:noProof/>
               </w:rPr>
-              <w:instrText xml:space="preserve"> PAGEREF _Toc239437919 \h </w:instrText>
+              <w:instrText xml:space="preserve"> PAGEREF _Toc239441162 \h </w:instrText>
             </w:r>
             <w:r>
               <w:rPr>
@@ -2125,7 +2124,7 @@
               <w14:ligatures w14:val="standardContextual"/>
             </w:rPr>
           </w:pPr>
-          <w:hyperlink w:anchor="_Toc239437920" w:history="1">
+          <w:hyperlink w:anchor="_Toc239441163" w:history="1">
             <w:r>
               <w:rPr>
                 <w:rStyle w:val="Hyperlink"/>
@@ -2149,7 +2148,7 @@
               <w:rPr>
                 <w:noProof/>
               </w:rPr>
-              <w:instrText xml:space="preserve"> PAGEREF _Toc239437920 \h </w:instrText>
+              <w:instrText xml:space="preserve"> PAGEREF _Toc239441163 \h </w:instrText>
             </w:r>
             <w:r>
               <w:rPr>
@@ -2191,7 +2190,7 @@
               <w14:ligatures w14:val="standardContextual"/>
             </w:rPr>
           </w:pPr>
-          <w:hyperlink w:anchor="_Toc239437921" w:history="1">
+          <w:hyperlink w:anchor="_Toc239441164" w:history="1">
             <w:r>
               <w:rPr>
                 <w:rStyle w:val="Hyperlink"/>
@@ -2215,7 +2214,7 @@
               <w:rPr>
                 <w:noProof/>
               </w:rPr>
-              <w:instrText xml:space="preserve"> PAGEREF _Toc239437921 \h </w:instrText>
+              <w:instrText xml:space="preserve"> PAGEREF _Toc239441164 \h </w:instrText>
             </w:r>
             <w:r>
               <w:rPr>
@@ -2257,7 +2256,7 @@
               <w14:ligatures w14:val="standardContextual"/>
             </w:rPr>
           </w:pPr>
-          <w:hyperlink w:anchor="_Toc239437922" w:history="1">
+          <w:hyperlink w:anchor="_Toc239441165" w:history="1">
             <w:r>
               <w:rPr>
                 <w:rStyle w:val="Hyperlink"/>
@@ -2281,7 +2280,7 @@
               <w:rPr>
                 <w:noProof/>
               </w:rPr>
-              <w:instrText xml:space="preserve"> PAGEREF _Toc239437922 \h </w:instrText>
+              <w:instrText xml:space="preserve"> PAGEREF _Toc239441165 \h </w:instrText>
             </w:r>
             <w:r>
               <w:rPr>
@@ -2323,7 +2322,7 @@
               <w14:ligatures w14:val="standardContextual"/>
             </w:rPr>
           </w:pPr>
-          <w:hyperlink w:anchor="_Toc239437923" w:history="1">
+          <w:hyperlink w:anchor="_Toc239441166" w:history="1">
             <w:r>
               <w:rPr>
                 <w:rStyle w:val="Hyperlink"/>
@@ -2347,7 +2346,7 @@
               <w:rPr>
                 <w:noProof/>
               </w:rPr>
-              <w:instrText xml:space="preserve"> PAGEREF _Toc239437923 \h </w:instrText>
+              <w:instrText xml:space="preserve"> PAGEREF _Toc239441166 \h </w:instrText>
             </w:r>
             <w:r>
               <w:rPr>
@@ -2389,7 +2388,7 @@
               <w14:ligatures w14:val="standardContextual"/>
             </w:rPr>
           </w:pPr>
-          <w:hyperlink w:anchor="_Toc239437924" w:history="1">
+          <w:hyperlink w:anchor="_Toc239441167" w:history="1">
             <w:r>
               <w:rPr>
                 <w:rStyle w:val="Hyperlink"/>
@@ -2413,7 +2412,7 @@
               <w:rPr>
                 <w:noProof/>
               </w:rPr>
-              <w:instrText xml:space="preserve"> PAGEREF _Toc239437924 \h </w:instrText>
+              <w:instrText xml:space="preserve"> PAGEREF _Toc239441167 \h </w:instrText>
             </w:r>
             <w:r>
               <w:rPr>
@@ -2455,7 +2454,7 @@
               <w14:ligatures w14:val="standardContextual"/>
             </w:rPr>
           </w:pPr>
-          <w:hyperlink w:anchor="_Toc239437925" w:history="1">
+          <w:hyperlink w:anchor="_Toc239441168" w:history="1">
             <w:r>
               <w:rPr>
                 <w:rStyle w:val="Hyperlink"/>
@@ -2479,7 +2478,7 @@
               <w:rPr>
                 <w:noProof/>
               </w:rPr>
-              <w:instrText xml:space="preserve"> PAGEREF _Toc239437925 \h </w:instrText>
+              <w:instrText xml:space="preserve"> PAGEREF _Toc239441168 \h </w:instrText>
             </w:r>
             <w:r>
               <w:rPr>
@@ -2521,7 +2520,7 @@
               <w14:ligatures w14:val="standardContextual"/>
             </w:rPr>
           </w:pPr>
-          <w:hyperlink w:anchor="_Toc239437926" w:history="1">
+          <w:hyperlink w:anchor="_Toc239441169" w:history="1">
             <w:r>
               <w:rPr>
                 <w:rStyle w:val="Hyperlink"/>
@@ -2545,7 +2544,7 @@
               <w:rPr>
                 <w:noProof/>
               </w:rPr>
-              <w:instrText xml:space="preserve"> PAGEREF _Toc239437926 \h </w:instrText>
+              <w:instrText xml:space="preserve"> PAGEREF _Toc239441169 \h </w:instrText>
             </w:r>
             <w:r>
               <w:rPr>
@@ -2587,7 +2586,7 @@
               <w14:ligatures w14:val="standardContextual"/>
             </w:rPr>
           </w:pPr>
-          <w:hyperlink w:anchor="_Toc239437927" w:history="1">
+          <w:hyperlink w:anchor="_Toc239441170" w:history="1">
             <w:r>
               <w:rPr>
                 <w:rStyle w:val="Hyperlink"/>
@@ -2611,7 +2610,7 @@
               <w:rPr>
                 <w:noProof/>
               </w:rPr>
-              <w:instrText xml:space="preserve"> PAGEREF _Toc239437927 \h </w:instrText>
+              <w:instrText xml:space="preserve"> PAGEREF _Toc239441170 \h </w:instrText>
             </w:r>
             <w:r>
               <w:rPr>
@@ -2653,7 +2652,7 @@
               <w14:ligatures w14:val="standardContextual"/>
             </w:rPr>
           </w:pPr>
-          <w:hyperlink w:anchor="_Toc239437928" w:history="1">
+          <w:hyperlink w:anchor="_Toc239441171" w:history="1">
             <w:r>
               <w:rPr>
                 <w:rStyle w:val="Hyperlink"/>
@@ -2677,7 +2676,7 @@
               <w:rPr>
                 <w:noProof/>
               </w:rPr>
-              <w:instrText xml:space="preserve"> PAGEREF _Toc239437928 \h </w:instrText>
+              <w:instrText xml:space="preserve"> PAGEREF _Toc239441171 \h </w:instrText>
             </w:r>
             <w:r>
               <w:rPr>
@@ -2719,7 +2718,7 @@
               <w14:ligatures w14:val="standardContextual"/>
             </w:rPr>
           </w:pPr>
-          <w:hyperlink w:anchor="_Toc239437929" w:history="1">
+          <w:hyperlink w:anchor="_Toc239441172" w:history="1">
             <w:r>
               <w:rPr>
                 <w:rStyle w:val="Hyperlink"/>
@@ -2743,7 +2742,7 @@
               <w:rPr>
                 <w:noProof/>
               </w:rPr>
-              <w:instrText xml:space="preserve"> PAGEREF _Toc239437929 \h </w:instrText>
+              <w:instrText xml:space="preserve"> PAGEREF _Toc239441172 \h </w:instrText>
             </w:r>
             <w:r>
               <w:rPr>
@@ -2785,7 +2784,7 @@
               <w14:ligatures w14:val="standardContextual"/>
             </w:rPr>
           </w:pPr>
-          <w:hyperlink w:anchor="_Toc239437930" w:history="1">
+          <w:hyperlink w:anchor="_Toc239441173" w:history="1">
             <w:r>
               <w:rPr>
                 <w:rStyle w:val="Hyperlink"/>
@@ -2809,7 +2808,7 @@
               <w:rPr>
                 <w:noProof/>
               </w:rPr>
-              <w:instrText xml:space="preserve"> PAGEREF _Toc239437930 \h </w:instrText>
+              <w:instrText xml:space="preserve"> PAGEREF _Toc239441173 \h </w:instrText>
             </w:r>
             <w:r>
               <w:rPr>
@@ -2851,7 +2850,7 @@
               <w14:ligatures w14:val="standardContextual"/>
             </w:rPr>
           </w:pPr>
-          <w:hyperlink w:anchor="_Toc239437931" w:history="1">
+          <w:hyperlink w:anchor="_Toc239441174" w:history="1">
             <w:r>
               <w:rPr>
                 <w:rStyle w:val="Hyperlink"/>
@@ -2875,7 +2874,7 @@
               <w:rPr>
                 <w:noProof/>
               </w:rPr>
-              <w:instrText xml:space="preserve"> PAGEREF _Toc239437931 \h </w:instrText>
+              <w:instrText xml:space="preserve"> PAGEREF _Toc239441174 \h </w:instrText>
             </w:r>
             <w:r>
               <w:rPr>
@@ -2917,7 +2916,7 @@
               <w14:ligatures w14:val="standardContextual"/>
             </w:rPr>
           </w:pPr>
-          <w:hyperlink w:anchor="_Toc239437932" w:history="1">
+          <w:hyperlink w:anchor="_Toc239441175" w:history="1">
             <w:r>
               <w:rPr>
                 <w:rStyle w:val="Hyperlink"/>
@@ -2941,7 +2940,7 @@
               <w:rPr>
                 <w:noProof/>
               </w:rPr>
-              <w:instrText xml:space="preserve"> PAGEREF _Toc239437932 \h </w:instrText>
+              <w:instrText xml:space="preserve"> PAGEREF _Toc239441175 \h </w:instrText>
             </w:r>
             <w:r>
               <w:rPr>
@@ -2983,7 +2982,7 @@
               <w14:ligatures w14:val="standardContextual"/>
             </w:rPr>
           </w:pPr>
-          <w:hyperlink w:anchor="_Toc239437933" w:history="1">
+          <w:hyperlink w:anchor="_Toc239441176" w:history="1">
             <w:r>
               <w:rPr>
                 <w:rStyle w:val="Hyperlink"/>
@@ -3007,7 +3006,7 @@
               <w:rPr>
                 <w:noProof/>
               </w:rPr>
-              <w:instrText xml:space="preserve"> PAGEREF _Toc239437933 \h </w:instrText>
+              <w:instrText xml:space="preserve"> PAGEREF _Toc239441176 \h </w:instrText>
             </w:r>
             <w:r>
               <w:rPr>
@@ -3049,7 +3048,7 @@
               <w14:ligatures w14:val="standardContextual"/>
             </w:rPr>
           </w:pPr>
-          <w:hyperlink w:anchor="_Toc239437934" w:history="1">
+          <w:hyperlink w:anchor="_Toc239441177" w:history="1">
             <w:r>
               <w:rPr>
                 <w:rStyle w:val="Hyperlink"/>
@@ -3073,7 +3072,7 @@
               <w:rPr>
                 <w:noProof/>
               </w:rPr>
-              <w:instrText xml:space="preserve"> PAGEREF _Toc239437934 \h </w:instrText>
+              <w:instrText xml:space="preserve"> PAGEREF _Toc239441177 \h </w:instrText>
             </w:r>
             <w:r>
               <w:rPr>
@@ -3115,7 +3114,7 @@
               <w14:ligatures w14:val="standardContextual"/>
             </w:rPr>
           </w:pPr>
-          <w:hyperlink w:anchor="_Toc239437935" w:history="1">
+          <w:hyperlink w:anchor="_Toc239441178" w:history="1">
             <w:r>
               <w:rPr>
                 <w:rStyle w:val="Hyperlink"/>
@@ -3139,7 +3138,7 @@
               <w:rPr>
                 <w:noProof/>
               </w:rPr>
-              <w:instrText xml:space="preserve"> PAGEREF _Toc239437935 \h </w:instrText>
+              <w:instrText xml:space="preserve"> PAGEREF _Toc239441178 \h </w:instrText>
             </w:r>
             <w:r>
               <w:rPr>
@@ -3181,7 +3180,7 @@
               <w14:ligatures w14:val="standardContextual"/>
             </w:rPr>
           </w:pPr>
-          <w:hyperlink w:anchor="_Toc239437936" w:history="1">
+          <w:hyperlink w:anchor="_Toc239441179" w:history="1">
             <w:r>
               <w:rPr>
                 <w:rStyle w:val="Hyperlink"/>
@@ -3205,7 +3204,7 @@
               <w:rPr>
                 <w:noProof/>
               </w:rPr>
-              <w:instrText xml:space="preserve"> PAGEREF _Toc239437936 \h </w:instrText>
+              <w:instrText xml:space="preserve"> PAGEREF _Toc239441179 \h </w:instrText>
             </w:r>
             <w:r>
               <w:rPr>
@@ -3247,7 +3246,7 @@
               <w14:ligatures w14:val="standardContextual"/>
             </w:rPr>
           </w:pPr>
-          <w:hyperlink w:anchor="_Toc239437937" w:history="1">
+          <w:hyperlink w:anchor="_Toc239441180" w:history="1">
             <w:r>
               <w:rPr>
                 <w:rStyle w:val="Hyperlink"/>
@@ -3271,7 +3270,7 @@
               <w:rPr>
                 <w:noProof/>
               </w:rPr>
-              <w:instrText xml:space="preserve"> PAGEREF _Toc239437937 \h </w:instrText>
+              <w:instrText xml:space="preserve"> PAGEREF _Toc239441180 \h </w:instrText>
             </w:r>
             <w:r>
               <w:rPr>
@@ -3313,7 +3312,7 @@
               <w14:ligatures w14:val="standardContextual"/>
             </w:rPr>
           </w:pPr>
-          <w:hyperlink w:anchor="_Toc239437938" w:history="1">
+          <w:hyperlink w:anchor="_Toc239441181" w:history="1">
             <w:r>
               <w:rPr>
                 <w:rStyle w:val="Hyperlink"/>
@@ -3337,7 +3336,7 @@
               <w:rPr>
                 <w:noProof/>
               </w:rPr>
-              <w:instrText xml:space="preserve"> PAGEREF _Toc239437938 \h </w:instrText>
+              <w:instrText xml:space="preserve"> PAGEREF _Toc239441181 \h </w:instrText>
             </w:r>
             <w:r>
               <w:rPr>
@@ -3379,7 +3378,7 @@
               <w14:ligatures w14:val="standardContextual"/>
             </w:rPr>
           </w:pPr>
-          <w:hyperlink w:anchor="_Toc239437939" w:history="1">
+          <w:hyperlink w:anchor="_Toc239441182" w:history="1">
             <w:r>
               <w:rPr>
                 <w:rStyle w:val="Hyperlink"/>
@@ -3403,7 +3402,7 @@
               <w:rPr>
                 <w:noProof/>
               </w:rPr>
-              <w:instrText xml:space="preserve"> PAGEREF _Toc239437939 \h </w:instrText>
+              <w:instrText xml:space="preserve"> PAGEREF _Toc239441182 \h </w:instrText>
             </w:r>
             <w:r>
               <w:rPr>
@@ -3445,7 +3444,7 @@
               <w14:ligatures w14:val="standardContextual"/>
             </w:rPr>
           </w:pPr>
-          <w:hyperlink w:anchor="_Toc239437940" w:history="1">
+          <w:hyperlink w:anchor="_Toc239441183" w:history="1">
             <w:r>
               <w:rPr>
                 <w:rStyle w:val="Hyperlink"/>
@@ -3469,7 +3468,7 @@
               <w:rPr>
                 <w:noProof/>
               </w:rPr>
-              <w:instrText xml:space="preserve"> PAGEREF _Toc239437940 \h </w:instrText>
+              <w:instrText xml:space="preserve"> PAGEREF _Toc239441183 \h </w:instrText>
             </w:r>
             <w:r>
               <w:rPr>
@@ -3511,7 +3510,7 @@
               <w14:ligatures w14:val="standardContextual"/>
             </w:rPr>
           </w:pPr>
-          <w:hyperlink w:anchor="_Toc239437941" w:history="1">
+          <w:hyperlink w:anchor="_Toc239441184" w:history="1">
             <w:r>
               <w:rPr>
                 <w:rStyle w:val="Hyperlink"/>
@@ -3535,7 +3534,7 @@
               <w:rPr>
                 <w:noProof/>
               </w:rPr>
-              <w:instrText xml:space="preserve"> PAGEREF _Toc239437941 \h </w:instrText>
+              <w:instrText xml:space="preserve"> PAGEREF _Toc239441184 \h </w:instrText>
             </w:r>
             <w:r>
               <w:rPr>
@@ -3577,7 +3576,7 @@
               <w14:ligatures w14:val="standardContextual"/>
             </w:rPr>
           </w:pPr>
-          <w:hyperlink w:anchor="_Toc239437942" w:history="1">
+          <w:hyperlink w:anchor="_Toc239441185" w:history="1">
             <w:r>
               <w:rPr>
                 <w:rStyle w:val="Hyperlink"/>
@@ -3601,7 +3600,7 @@
               <w:rPr>
                 <w:noProof/>
               </w:rPr>
-              <w:instrText xml:space="preserve"> PAGEREF _Toc239437942 \h </w:instrText>
+              <w:instrText xml:space="preserve"> PAGEREF _Toc239441185 \h </w:instrText>
             </w:r>
             <w:r>
               <w:rPr>
@@ -3643,7 +3642,7 @@
               <w14:ligatures w14:val="standardContextual"/>
             </w:rPr>
           </w:pPr>
-          <w:hyperlink w:anchor="_Toc239437943" w:history="1">
+          <w:hyperlink w:anchor="_Toc239441186" w:history="1">
             <w:r>
               <w:rPr>
                 <w:rStyle w:val="Hyperlink"/>
@@ -3667,7 +3666,7 @@
               <w:rPr>
                 <w:noProof/>
               </w:rPr>
-              <w:instrText xml:space="preserve"> PAGEREF _Toc239437943 \h </w:instrText>
+              <w:instrText xml:space="preserve"> PAGEREF _Toc239441186 \h </w:instrText>
             </w:r>
             <w:r>
               <w:rPr>
@@ -3709,7 +3708,7 @@
               <w14:ligatures w14:val="standardContextual"/>
             </w:rPr>
           </w:pPr>
-          <w:hyperlink w:anchor="_Toc239437944" w:history="1">
+          <w:hyperlink w:anchor="_Toc239441187" w:history="1">
             <w:r>
               <w:rPr>
                 <w:rStyle w:val="Hyperlink"/>
@@ -3733,7 +3732,7 @@
               <w:rPr>
                 <w:noProof/>
               </w:rPr>
-              <w:instrText xml:space="preserve"> PAGEREF _Toc239437944 \h </w:instrText>
+              <w:instrText xml:space="preserve"> PAGEREF _Toc239441187 \h </w:instrText>
             </w:r>
             <w:r>
               <w:rPr>
@@ -3775,7 +3774,7 @@
               <w14:ligatures w14:val="standardContextual"/>
             </w:rPr>
           </w:pPr>
-          <w:hyperlink w:anchor="_Toc239437945" w:history="1">
+          <w:hyperlink w:anchor="_Toc239441188" w:history="1">
             <w:r>
               <w:rPr>
                 <w:rStyle w:val="Hyperlink"/>
@@ -3799,7 +3798,7 @@
               <w:rPr>
                 <w:noProof/>
               </w:rPr>
-              <w:instrText xml:space="preserve"> PAGEREF _Toc239437945 \h </w:instrText>
+              <w:instrText xml:space="preserve"> PAGEREF _Toc239441188 \h </w:instrText>
             </w:r>
             <w:r>
               <w:rPr>
@@ -3841,7 +3840,7 @@
               <w14:ligatures w14:val="standardContextual"/>
             </w:rPr>
           </w:pPr>
-          <w:hyperlink w:anchor="_Toc239437946" w:history="1">
+          <w:hyperlink w:anchor="_Toc239441189" w:history="1">
             <w:r>
               <w:rPr>
                 <w:rStyle w:val="Hyperlink"/>
@@ -3865,7 +3864,7 @@
               <w:rPr>
                 <w:noProof/>
               </w:rPr>
-              <w:instrText xml:space="preserve"> PAGEREF _Toc239437946 \h </w:instrText>
+              <w:instrText xml:space="preserve"> PAGEREF _Toc239441189 \h </w:instrText>
             </w:r>
             <w:r>
               <w:rPr>
@@ -3907,7 +3906,7 @@
               <w14:ligatures w14:val="standardContextual"/>
             </w:rPr>
           </w:pPr>
-          <w:hyperlink w:anchor="_Toc239437947" w:history="1">
+          <w:hyperlink w:anchor="_Toc239441190" w:history="1">
             <w:r>
               <w:rPr>
                 <w:rStyle w:val="Hyperlink"/>
@@ -3931,7 +3930,7 @@
               <w:rPr>
                 <w:noProof/>
               </w:rPr>
-              <w:instrText xml:space="preserve"> PAGEREF _Toc239437947 \h </w:instrText>
+              <w:instrText xml:space="preserve"> PAGEREF _Toc239441190 \h </w:instrText>
             </w:r>
             <w:r>
               <w:rPr>
@@ -3973,7 +3972,7 @@
               <w14:ligatures w14:val="standardContextual"/>
             </w:rPr>
           </w:pPr>
-          <w:hyperlink w:anchor="_Toc239437948" w:history="1">
+          <w:hyperlink w:anchor="_Toc239441191" w:history="1">
             <w:r>
               <w:rPr>
                 <w:rStyle w:val="Hyperlink"/>
@@ -3997,7 +3996,7 @@
               <w:rPr>
                 <w:noProof/>
               </w:rPr>
-              <w:instrText xml:space="preserve"> PAGEREF _Toc239437948 \h </w:instrText>
+              <w:instrText xml:space="preserve"> PAGEREF _Toc239441191 \h </w:instrText>
             </w:r>
             <w:r>
               <w:rPr>
@@ -4039,7 +4038,7 @@
               <w14:ligatures w14:val="standardContextual"/>
             </w:rPr>
           </w:pPr>
-          <w:hyperlink w:anchor="_Toc239437949" w:history="1">
+          <w:hyperlink w:anchor="_Toc239441192" w:history="1">
             <w:r>
               <w:rPr>
                 <w:rStyle w:val="Hyperlink"/>
@@ -4063,7 +4062,7 @@
               <w:rPr>
                 <w:noProof/>
               </w:rPr>
-              <w:instrText xml:space="preserve"> PAGEREF _Toc239437949 \h </w:instrText>
+              <w:instrText xml:space="preserve"> PAGEREF _Toc239441192 \h </w:instrText>
             </w:r>
             <w:r>
               <w:rPr>
@@ -4105,7 +4104,7 @@
               <w14:ligatures w14:val="standardContextual"/>
             </w:rPr>
           </w:pPr>
-          <w:hyperlink w:anchor="_Toc239437950" w:history="1">
+          <w:hyperlink w:anchor="_Toc239441193" w:history="1">
             <w:r>
               <w:rPr>
                 <w:rStyle w:val="Hyperlink"/>
@@ -4129,7 +4128,7 @@
               <w:rPr>
                 <w:noProof/>
               </w:rPr>
-              <w:instrText xml:space="preserve"> PAGEREF _Toc239437950 \h </w:instrText>
+              <w:instrText xml:space="preserve"> PAGEREF _Toc239441193 \h </w:instrText>
             </w:r>
             <w:r>
               <w:rPr>
@@ -4171,7 +4170,7 @@
               <w14:ligatures w14:val="standardContextual"/>
             </w:rPr>
           </w:pPr>
-          <w:hyperlink w:anchor="_Toc239437951" w:history="1">
+          <w:hyperlink w:anchor="_Toc239441194" w:history="1">
             <w:r>
               <w:rPr>
                 <w:rStyle w:val="Hyperlink"/>
@@ -4195,7 +4194,7 @@
               <w:rPr>
                 <w:noProof/>
               </w:rPr>
-              <w:instrText xml:space="preserve"> PAGEREF _Toc239437951 \h </w:instrText>
+              <w:instrText xml:space="preserve"> PAGEREF _Toc239441194 \h </w:instrText>
             </w:r>
             <w:r>
               <w:rPr>
@@ -4237,7 +4236,7 @@
               <w14:ligatures w14:val="standardContextual"/>
             </w:rPr>
           </w:pPr>
-          <w:hyperlink w:anchor="_Toc239437952" w:history="1">
+          <w:hyperlink w:anchor="_Toc239441195" w:history="1">
             <w:r>
               <w:rPr>
                 <w:rStyle w:val="Hyperlink"/>
@@ -4261,7 +4260,7 @@
               <w:rPr>
                 <w:noProof/>
               </w:rPr>
-              <w:instrText xml:space="preserve"> PAGEREF _Toc239437952 \h </w:instrText>
+              <w:instrText xml:space="preserve"> PAGEREF _Toc239441195 \h </w:instrText>
             </w:r>
             <w:r>
               <w:rPr>
@@ -4303,7 +4302,7 @@
               <w14:ligatures w14:val="standardContextual"/>
             </w:rPr>
           </w:pPr>
-          <w:hyperlink w:anchor="_Toc239437953" w:history="1">
+          <w:hyperlink w:anchor="_Toc239441196" w:history="1">
             <w:r>
               <w:rPr>
                 <w:rStyle w:val="Hyperlink"/>
@@ -4327,7 +4326,7 @@
               <w:rPr>
                 <w:noProof/>
               </w:rPr>
-              <w:instrText xml:space="preserve"> PAGEREF _Toc239437953 \h </w:instrText>
+              <w:instrText xml:space="preserve"> PAGEREF _Toc239441196 \h </w:instrText>
             </w:r>
             <w:r>
               <w:rPr>
@@ -4369,7 +4368,7 @@
               <w14:ligatures w14:val="standardContextual"/>
             </w:rPr>
           </w:pPr>
-          <w:hyperlink w:anchor="_Toc239437954" w:history="1">
+          <w:hyperlink w:anchor="_Toc239441197" w:history="1">
             <w:r>
               <w:rPr>
                 <w:rStyle w:val="Hyperlink"/>
@@ -4393,7 +4392,7 @@
               <w:rPr>
                 <w:noProof/>
               </w:rPr>
-              <w:instrText xml:space="preserve"> PAGEREF _Toc239437954 \h </w:instrText>
+              <w:instrText xml:space="preserve"> PAGEREF _Toc239441197 \h </w:instrText>
             </w:r>
             <w:r>
               <w:rPr>
@@ -4435,7 +4434,7 @@
               <w14:ligatures w14:val="standardContextual"/>
             </w:rPr>
           </w:pPr>
-          <w:hyperlink w:anchor="_Toc239437955" w:history="1">
+          <w:hyperlink w:anchor="_Toc239441198" w:history="1">
             <w:r>
               <w:rPr>
                 <w:rStyle w:val="Hyperlink"/>
@@ -4459,7 +4458,7 @@
               <w:rPr>
                 <w:noProof/>
               </w:rPr>
-              <w:instrText xml:space="preserve"> PAGEREF _Toc239437955 \h </w:instrText>
+              <w:instrText xml:space="preserve"> PAGEREF _Toc239441198 \h </w:instrText>
             </w:r>
             <w:r>
               <w:rPr>
@@ -4501,7 +4500,7 @@
               <w14:ligatures w14:val="standardContextual"/>
             </w:rPr>
           </w:pPr>
-          <w:hyperlink w:anchor="_Toc239437956" w:history="1">
+          <w:hyperlink w:anchor="_Toc239441199" w:history="1">
             <w:r>
               <w:rPr>
                 <w:rStyle w:val="Hyperlink"/>
@@ -4525,7 +4524,7 @@
               <w:rPr>
                 <w:noProof/>
               </w:rPr>
-              <w:instrText xml:space="preserve"> PAGEREF _Toc239437956 \h </w:instrText>
+              <w:instrText xml:space="preserve"> PAGEREF _Toc239441199 \h </w:instrText>
             </w:r>
             <w:r>
               <w:rPr>
@@ -4567,7 +4566,7 @@
               <w14:ligatures w14:val="standardContextual"/>
             </w:rPr>
           </w:pPr>
-          <w:hyperlink w:anchor="_Toc239437957" w:history="1">
+          <w:hyperlink w:anchor="_Toc239441200" w:history="1">
             <w:r>
               <w:rPr>
                 <w:rStyle w:val="Hyperlink"/>
@@ -4591,7 +4590,7 @@
               <w:rPr>
                 <w:noProof/>
               </w:rPr>
-              <w:instrText xml:space="preserve"> PAGEREF _Toc239437957 \h </w:instrText>
+              <w:instrText xml:space="preserve"> PAGEREF _Toc239441200 \h </w:instrText>
             </w:r>
             <w:r>
               <w:rPr>
@@ -4633,7 +4632,7 @@
               <w14:ligatures w14:val="standardContextual"/>
             </w:rPr>
           </w:pPr>
-          <w:hyperlink w:anchor="_Toc239437958" w:history="1">
+          <w:hyperlink w:anchor="_Toc239441201" w:history="1">
             <w:r>
               <w:rPr>
                 <w:rStyle w:val="Hyperlink"/>
@@ -4657,7 +4656,7 @@
               <w:rPr>
                 <w:noProof/>
               </w:rPr>
-              <w:instrText xml:space="preserve"> PAGEREF _Toc239437958 \h </w:instrText>
+              <w:instrText xml:space="preserve"> PAGEREF _Toc239441201 \h </w:instrText>
             </w:r>
             <w:r>
               <w:rPr>
@@ -4699,7 +4698,7 @@
               <w14:ligatures w14:val="standardContextual"/>
             </w:rPr>
           </w:pPr>
-          <w:hyperlink w:anchor="_Toc239437959" w:history="1">
+          <w:hyperlink w:anchor="_Toc239441202" w:history="1">
             <w:r>
               <w:rPr>
                 <w:rStyle w:val="Hyperlink"/>
@@ -4723,7 +4722,7 @@
               <w:rPr>
                 <w:noProof/>
               </w:rPr>
-              <w:instrText xml:space="preserve"> PAGEREF _Toc239437959 \h </w:instrText>
+              <w:instrText xml:space="preserve"> PAGEREF _Toc239441202 \h </w:instrText>
             </w:r>
             <w:r>
               <w:rPr>
@@ -4765,7 +4764,7 @@
               <w14:ligatures w14:val="standardContextual"/>
             </w:rPr>
           </w:pPr>
-          <w:hyperlink w:anchor="_Toc239437960" w:history="1">
+          <w:hyperlink w:anchor="_Toc239441203" w:history="1">
             <w:r>
               <w:rPr>
                 <w:rStyle w:val="Hyperlink"/>
@@ -4789,7 +4788,7 @@
               <w:rPr>
                 <w:noProof/>
               </w:rPr>
-              <w:instrText xml:space="preserve"> PAGEREF _Toc239437960 \h </w:instrText>
+              <w:instrText xml:space="preserve"> PAGEREF _Toc239441203 \h </w:instrText>
             </w:r>
             <w:r>
               <w:rPr>
@@ -4831,7 +4830,7 @@
               <w14:ligatures w14:val="standardContextual"/>
             </w:rPr>
           </w:pPr>
-          <w:hyperlink w:anchor="_Toc239437961" w:history="1">
+          <w:hyperlink w:anchor="_Toc239441204" w:history="1">
             <w:r>
               <w:rPr>
                 <w:rStyle w:val="Hyperlink"/>
@@ -4855,7 +4854,7 @@
               <w:rPr>
                 <w:noProof/>
               </w:rPr>
-              <w:instrText xml:space="preserve"> PAGEREF _Toc239437961 \h </w:instrText>
+              <w:instrText xml:space="preserve"> PAGEREF _Toc239441204 \h </w:instrText>
             </w:r>
             <w:r>
               <w:rPr>
@@ -4897,7 +4896,7 @@
               <w14:ligatures w14:val="standardContextual"/>
             </w:rPr>
           </w:pPr>
-          <w:hyperlink w:anchor="_Toc239437962" w:history="1">
+          <w:hyperlink w:anchor="_Toc239441205" w:history="1">
             <w:r>
               <w:rPr>
                 <w:rStyle w:val="Hyperlink"/>
@@ -4921,7 +4920,7 @@
               <w:rPr>
                 <w:noProof/>
               </w:rPr>
-              <w:instrText xml:space="preserve"> PAGEREF _Toc239437962 \h </w:instrText>
+              <w:instrText xml:space="preserve"> PAGEREF _Toc239441205 \h </w:instrText>
             </w:r>
             <w:r>
               <w:rPr>
@@ -4964,9 +4963,8 @@
       <w:pPr>
         <w:pStyle w:val="Heading1"/>
       </w:pPr>
-      <w:bookmarkStart w:id="0" w:name="_Toc239437890"/>
-      <w:r>
-        <w:lastRenderedPageBreak/>
+      <w:bookmarkStart w:id="0" w:name="_Toc239441133"/>
+      <w:r>
         <w:t>1. Introducción</w:t>
       </w:r>
       <w:bookmarkEnd w:id="0"/>
@@ -4975,7 +4973,7 @@
       <w:pPr>
         <w:pStyle w:val="Heading2"/>
       </w:pPr>
-      <w:bookmarkStart w:id="1" w:name="_Toc239437891"/>
+      <w:bookmarkStart w:id="1" w:name="_Toc239441134"/>
       <w:r>
         <w:t>1.1 Qué es la plataforma</w:t>
       </w:r>
@@ -5001,7 +4999,7 @@
       <w:pPr>
         <w:pStyle w:val="Heading2"/>
       </w:pPr>
-      <w:bookmarkStart w:id="2" w:name="_Toc239437892"/>
+      <w:bookmarkStart w:id="2" w:name="_Toc239441135"/>
       <w:r>
         <w:t>1.2 Principio rector: la IA propone, las personas deciden</w:t>
       </w:r>
@@ -5019,7 +5017,7 @@
       <w:pPr>
         <w:pStyle w:val="Heading2"/>
       </w:pPr>
-      <w:bookmarkStart w:id="3" w:name="_Toc239437893"/>
+      <w:bookmarkStart w:id="3" w:name="_Toc239441136"/>
       <w:r>
         <w:t>1.3 A quién va dirigido este manual</w:t>
       </w:r>
@@ -5109,7 +5107,7 @@
       <w:pPr>
         <w:pStyle w:val="Heading2"/>
       </w:pPr>
-      <w:bookmarkStart w:id="4" w:name="_Toc239437894"/>
+      <w:bookmarkStart w:id="4" w:name="_Toc239441137"/>
       <w:r>
         <w:t>1.4 Estado actual y alcance</w:t>
       </w:r>
@@ -5132,9 +5130,8 @@
       <w:pPr>
         <w:pStyle w:val="Heading1"/>
       </w:pPr>
-      <w:bookmarkStart w:id="5" w:name="_Toc239437895"/>
-      <w:r>
-        <w:lastRenderedPageBreak/>
+      <w:bookmarkStart w:id="5" w:name="_Toc239441138"/>
+      <w:r>
         <w:t>2. Conceptos clave</w:t>
       </w:r>
       <w:bookmarkEnd w:id="5"/>
@@ -5143,7 +5140,7 @@
       <w:pPr>
         <w:pStyle w:val="Heading2"/>
       </w:pPr>
-      <w:bookmarkStart w:id="6" w:name="_Toc239437896"/>
+      <w:bookmarkStart w:id="6" w:name="_Toc239441139"/>
       <w:r>
         <w:t>2.1 Entidades principales</w:t>
       </w:r>
@@ -5966,7 +5963,7 @@
       <w:pPr>
         <w:pStyle w:val="Heading2"/>
       </w:pPr>
-      <w:bookmarkStart w:id="7" w:name="_Toc239437897"/>
+      <w:bookmarkStart w:id="7" w:name="_Toc239441140"/>
       <w:r>
         <w:t>2.2 Estados de un pendiente</w:t>
       </w:r>
@@ -6640,7 +6637,6 @@
                 <w:sz w:val="19"/>
                 <w:szCs w:val="19"/>
               </w:rPr>
-              <w:lastRenderedPageBreak/>
               <w:t>COMPLETION_PROPOSED</w:t>
             </w:r>
           </w:p>
@@ -6933,7 +6929,7 @@
       <w:pPr>
         <w:pStyle w:val="Heading2"/>
       </w:pPr>
-      <w:bookmarkStart w:id="8" w:name="_Toc239437898"/>
+      <w:bookmarkStart w:id="8" w:name="_Toc239441141"/>
       <w:r>
         <w:t>2.3 Vencimiento y semana</w:t>
       </w:r>
@@ -6951,7 +6947,7 @@
       <w:pPr>
         <w:pStyle w:val="Heading2"/>
       </w:pPr>
-      <w:bookmarkStart w:id="9" w:name="_Toc239437899"/>
+      <w:bookmarkStart w:id="9" w:name="_Toc239441142"/>
       <w:r>
         <w:t>2.4 Confianza de la IA</w:t>
       </w:r>
@@ -7029,7 +7025,7 @@
       <w:pPr>
         <w:pStyle w:val="Heading2"/>
       </w:pPr>
-      <w:bookmarkStart w:id="10" w:name="_Toc239437900"/>
+      <w:bookmarkStart w:id="10" w:name="_Toc239441143"/>
       <w:r>
         <w:t>2.5 Calidad de captura</w:t>
       </w:r>
@@ -7047,7 +7043,7 @@
       <w:pPr>
         <w:pStyle w:val="Heading2"/>
       </w:pPr>
-      <w:bookmarkStart w:id="11" w:name="_Toc239437901"/>
+      <w:bookmarkStart w:id="11" w:name="_Toc239441144"/>
       <w:r>
         <w:t>2.6 Roles y permisos</w:t>
       </w:r>
@@ -7108,7 +7104,6 @@
                 <w:sz w:val="19"/>
                 <w:szCs w:val="19"/>
               </w:rPr>
-              <w:lastRenderedPageBreak/>
               <w:t>Rol</w:t>
             </w:r>
           </w:p>
@@ -7589,9 +7584,8 @@
       <w:pPr>
         <w:pStyle w:val="Heading1"/>
       </w:pPr>
-      <w:bookmarkStart w:id="12" w:name="_Toc239437902"/>
-      <w:r>
-        <w:lastRenderedPageBreak/>
+      <w:bookmarkStart w:id="12" w:name="_Toc239441145"/>
+      <w:r>
         <w:t>3. Acceso a la plataforma</w:t>
       </w:r>
       <w:bookmarkEnd w:id="12"/>
@@ -7600,7 +7594,7 @@
       <w:pPr>
         <w:pStyle w:val="Heading2"/>
       </w:pPr>
-      <w:bookmarkStart w:id="13" w:name="_Toc239437903"/>
+      <w:bookmarkStart w:id="13" w:name="_Toc239441146"/>
       <w:r>
         <w:t>3.1 Dirección y requisitos</w:t>
       </w:r>
@@ -7672,7 +7666,7 @@
       <w:pPr>
         <w:pStyle w:val="Heading2"/>
       </w:pPr>
-      <w:bookmarkStart w:id="14" w:name="_Toc239437904"/>
+      <w:bookmarkStart w:id="14" w:name="_Toc239441147"/>
       <w:r>
         <w:t>3.2 Iniciar sesión</w:t>
       </w:r>
@@ -7714,14 +7708,14 @@
         <w:spacing w:after="80" w:line="300" w:lineRule="auto"/>
       </w:pPr>
       <w:r>
-        <w:t>Al entrar por primera vez la cuenta se crea con rol Miembro. Un Administrador asigna el rol y el área definitivos en Administración → Usuarios.</w:t>
+        <w:t>Al entrar por primera vez la cuenta se da de alta automáticamente con rol Miembro. Un Administrador asigna el rol y el área definitivos en Administración → Usuarios.</w:t>
       </w:r>
     </w:p>
     <w:p>
       <w:pPr>
         <w:pStyle w:val="Heading2"/>
       </w:pPr>
-      <w:bookmarkStart w:id="15" w:name="_Toc239437905"/>
+      <w:bookmarkStart w:id="15" w:name="_Toc239441148"/>
       <w:r>
         <w:t>3.3 Primer administrador</w:t>
       </w:r>
@@ -7732,7 +7726,7 @@
         <w:spacing w:after="120" w:line="300" w:lineRule="auto"/>
       </w:pPr>
       <w:r>
-        <w:t>En una instalación nueva no existe ningún Administrador. La primera cuenta se eleva a ese rol directamente en la base de datos, una sola vez, desde la terminal del contenedor de PostgreSQL en Dokploy (ver capítulo 10):</w:t>
+        <w:t>En una instalación nueva no existe ningún usuario. La primera cuenta del dominio que inicia sesión queda automáticamente como Administrador, para poder configurar la plataforma; todas las siguientes entran como Miembro. Si más adelante hace falta elevar otra cuenta sin pasar por Administración, puede hacerse una sola vez desde la terminal del contenedor de PostgreSQL en Dokploy (ver capítulo 10):</w:t>
       </w:r>
     </w:p>
     <w:p>
@@ -7748,7 +7742,7 @@
           <w:sz w:val="19"/>
           <w:szCs w:val="19"/>
         </w:rPr>
-        <w:t>psql -U smlxl -d smlxl -c "UPDATE users SET role='ADMIN' WHERE email='cuenta@smlxl.mx';"</w:t>
+        <w:t>psql -U smlxl -d smlxl -c "UPDATE users SET role='ADMIN' WHERE lower(email)='cuenta@smlxl.mx';"</w:t>
       </w:r>
     </w:p>
     <w:p>
@@ -7756,14 +7750,14 @@
         <w:spacing w:after="120" w:line="300" w:lineRule="auto"/>
       </w:pPr>
       <w:r>
-        <w:t>Cierra sesión y vuelve a entrar; aparecerán Administración, Configuración e Integraciones en el menú.</w:t>
+        <w:t>Tras cambiar un rol, la persona debe cerrar sesión y volver a entrar para que aparezcan Administración, Configuración e Integraciones en el menú.</w:t>
       </w:r>
     </w:p>
     <w:p>
       <w:pPr>
         <w:pStyle w:val="Heading2"/>
       </w:pPr>
-      <w:bookmarkStart w:id="16" w:name="_Toc239437906"/>
+      <w:bookmarkStart w:id="16" w:name="_Toc239441149"/>
       <w:r>
         <w:t>3.4 Cerrar sesión</w:t>
       </w:r>
@@ -7781,7 +7775,7 @@
       <w:pPr>
         <w:pStyle w:val="Heading2"/>
       </w:pPr>
-      <w:bookmarkStart w:id="17" w:name="_Toc239437907"/>
+      <w:bookmarkStart w:id="17" w:name="_Toc239441150"/>
       <w:r>
         <w:t>3.5 Mensajes de acceso</w:t>
       </w:r>
@@ -8081,7 +8075,6 @@
                 <w:sz w:val="19"/>
                 <w:szCs w:val="19"/>
               </w:rPr>
-              <w:lastRenderedPageBreak/>
               <w:t>redirect_uri_mismatch (pantalla de Google)</w:t>
             </w:r>
           </w:p>
@@ -8143,9 +8136,8 @@
       <w:pPr>
         <w:pStyle w:val="Heading1"/>
       </w:pPr>
-      <w:bookmarkStart w:id="18" w:name="_Toc239437908"/>
-      <w:r>
-        <w:lastRenderedPageBreak/>
+      <w:bookmarkStart w:id="18" w:name="_Toc239441151"/>
+      <w:r>
         <w:t>4. Recorrido por la interfaz</w:t>
       </w:r>
       <w:bookmarkEnd w:id="18"/>
@@ -8154,7 +8146,7 @@
       <w:pPr>
         <w:pStyle w:val="Heading2"/>
       </w:pPr>
-      <w:bookmarkStart w:id="19" w:name="_Toc239437909"/>
+      <w:bookmarkStart w:id="19" w:name="_Toc239441152"/>
       <w:r>
         <w:t>4.1 Estructura de la pantalla</w:t>
       </w:r>
@@ -8180,7 +8172,7 @@
       <w:pPr>
         <w:pStyle w:val="Heading2"/>
       </w:pPr>
-      <w:bookmarkStart w:id="20" w:name="_Toc239437910"/>
+      <w:bookmarkStart w:id="20" w:name="_Toc239441153"/>
       <w:r>
         <w:t>4.2 Inicio (panorama)</w:t>
       </w:r>
@@ -8318,7 +8310,7 @@
       <w:pPr>
         <w:pStyle w:val="Heading2"/>
       </w:pPr>
-      <w:bookmarkStart w:id="21" w:name="_Toc239437911"/>
+      <w:bookmarkStart w:id="21" w:name="_Toc239441154"/>
       <w:r>
         <w:t>4.3 Búsqueda global</w:t>
       </w:r>
@@ -8341,9 +8333,8 @@
       <w:pPr>
         <w:pStyle w:val="Heading1"/>
       </w:pPr>
-      <w:bookmarkStart w:id="22" w:name="_Toc239437912"/>
-      <w:r>
-        <w:lastRenderedPageBreak/>
+      <w:bookmarkStart w:id="22" w:name="_Toc239441155"/>
+      <w:r>
         <w:t>5. Reuniones</w:t>
       </w:r>
       <w:bookmarkEnd w:id="22"/>
@@ -8352,7 +8343,7 @@
       <w:pPr>
         <w:pStyle w:val="Heading2"/>
       </w:pPr>
-      <w:bookmarkStart w:id="23" w:name="_Toc239437913"/>
+      <w:bookmarkStart w:id="23" w:name="_Toc239441156"/>
       <w:r>
         <w:t>5.1 Listado</w:t>
       </w:r>
@@ -8370,7 +8361,7 @@
       <w:pPr>
         <w:pStyle w:val="Heading2"/>
       </w:pPr>
-      <w:bookmarkStart w:id="24" w:name="_Toc239437914"/>
+      <w:bookmarkStart w:id="24" w:name="_Toc239441157"/>
       <w:r>
         <w:t>5.2 Estados de procesamiento</w:t>
       </w:r>
@@ -8904,7 +8895,7 @@
       <w:pPr>
         <w:pStyle w:val="Heading2"/>
       </w:pPr>
-      <w:bookmarkStart w:id="25" w:name="_Toc239437915"/>
+      <w:bookmarkStart w:id="25" w:name="_Toc239441158"/>
       <w:r>
         <w:t>5.3 Detalle de una reunión</w:t>
       </w:r>
@@ -9062,9 +9053,8 @@
       <w:pPr>
         <w:pStyle w:val="Heading2"/>
       </w:pPr>
-      <w:bookmarkStart w:id="26" w:name="_Toc239437916"/>
-      <w:r>
-        <w:lastRenderedPageBreak/>
+      <w:bookmarkStart w:id="26" w:name="_Toc239441159"/>
+      <w:r>
         <w:t>5.4 Ver evidencia</w:t>
       </w:r>
       <w:bookmarkEnd w:id="26"/>
@@ -9081,7 +9071,7 @@
       <w:pPr>
         <w:pStyle w:val="Heading2"/>
       </w:pPr>
-      <w:bookmarkStart w:id="27" w:name="_Toc239437917"/>
+      <w:bookmarkStart w:id="27" w:name="_Toc239441160"/>
       <w:r>
         <w:t>5.5 Confidencialidad y exclusión</w:t>
       </w:r>
@@ -9099,7 +9089,7 @@
       <w:pPr>
         <w:pStyle w:val="Heading2"/>
       </w:pPr>
-      <w:bookmarkStart w:id="28" w:name="_Toc239437918"/>
+      <w:bookmarkStart w:id="28" w:name="_Toc239441161"/>
       <w:r>
         <w:t>5.6 Reprocesar</w:t>
       </w:r>
@@ -9117,7 +9107,7 @@
       <w:pPr>
         <w:pStyle w:val="Heading2"/>
       </w:pPr>
-      <w:bookmarkStart w:id="29" w:name="_Toc239437919"/>
+      <w:bookmarkStart w:id="29" w:name="_Toc239441162"/>
       <w:r>
         <w:t>5.7 Registrar una reunión manualmente</w:t>
       </w:r>
@@ -9140,9 +9130,8 @@
       <w:pPr>
         <w:pStyle w:val="Heading1"/>
       </w:pPr>
-      <w:bookmarkStart w:id="30" w:name="_Toc239437920"/>
-      <w:r>
-        <w:lastRenderedPageBreak/>
+      <w:bookmarkStart w:id="30" w:name="_Toc239441163"/>
+      <w:r>
         <w:t>6. Pendientes</w:t>
       </w:r>
       <w:bookmarkEnd w:id="30"/>
@@ -9159,7 +9148,7 @@
       <w:pPr>
         <w:pStyle w:val="Heading2"/>
       </w:pPr>
-      <w:bookmarkStart w:id="31" w:name="_Toc239437921"/>
+      <w:bookmarkStart w:id="31" w:name="_Toc239441164"/>
       <w:r>
         <w:t>6.1 Vistas</w:t>
       </w:r>
@@ -9801,7 +9790,7 @@
       <w:pPr>
         <w:pStyle w:val="Heading2"/>
       </w:pPr>
-      <w:bookmarkStart w:id="32" w:name="_Toc239437922"/>
+      <w:bookmarkStart w:id="32" w:name="_Toc239441165"/>
       <w:r>
         <w:t>6.2 Tabla y tablero</w:t>
       </w:r>
@@ -9819,7 +9808,7 @@
       <w:pPr>
         <w:pStyle w:val="Heading2"/>
       </w:pPr>
-      <w:bookmarkStart w:id="33" w:name="_Toc239437923"/>
+      <w:bookmarkStart w:id="33" w:name="_Toc239441166"/>
       <w:r>
         <w:t>6.3 Acciones rápidas en cada fila</w:t>
       </w:r>
@@ -9894,7 +9883,7 @@
       <w:pPr>
         <w:pStyle w:val="Heading2"/>
       </w:pPr>
-      <w:bookmarkStart w:id="34" w:name="_Toc239437924"/>
+      <w:bookmarkStart w:id="34" w:name="_Toc239441167"/>
       <w:r>
         <w:t>6.4 Crear un pendiente</w:t>
       </w:r>
@@ -9912,9 +9901,8 @@
       <w:pPr>
         <w:pStyle w:val="Heading2"/>
       </w:pPr>
-      <w:bookmarkStart w:id="35" w:name="_Toc239437925"/>
-      <w:r>
-        <w:lastRenderedPageBreak/>
+      <w:bookmarkStart w:id="35" w:name="_Toc239441168"/>
+      <w:r>
         <w:t>6.5 Detalle de un pendiente</w:t>
       </w:r>
       <w:bookmarkEnd w:id="35"/>
@@ -9931,7 +9919,7 @@
       <w:pPr>
         <w:pStyle w:val="Heading2"/>
       </w:pPr>
-      <w:bookmarkStart w:id="36" w:name="_Toc239437926"/>
+      <w:bookmarkStart w:id="36" w:name="_Toc239441169"/>
       <w:r>
         <w:t>6.6 Aprobar o rechazar un cierre</w:t>
       </w:r>
@@ -10014,7 +10002,7 @@
       <w:pPr>
         <w:pStyle w:val="Heading2"/>
       </w:pPr>
-      <w:bookmarkStart w:id="37" w:name="_Toc239437927"/>
+      <w:bookmarkStart w:id="37" w:name="_Toc239441170"/>
       <w:r>
         <w:t>6.7 Pendientes recurrentes</w:t>
       </w:r>
@@ -10032,7 +10020,7 @@
       <w:pPr>
         <w:pStyle w:val="Heading2"/>
       </w:pPr>
-      <w:bookmarkStart w:id="38" w:name="_Toc239437928"/>
+      <w:bookmarkStart w:id="38" w:name="_Toc239441171"/>
       <w:r>
         <w:t>6.8 Reabrir</w:t>
       </w:r>
@@ -10055,9 +10043,8 @@
       <w:pPr>
         <w:pStyle w:val="Heading1"/>
       </w:pPr>
-      <w:bookmarkStart w:id="39" w:name="_Toc239437929"/>
-      <w:r>
-        <w:lastRenderedPageBreak/>
+      <w:bookmarkStart w:id="39" w:name="_Toc239441172"/>
+      <w:r>
         <w:t>7. Revisión IA</w:t>
       </w:r>
       <w:bookmarkEnd w:id="39"/>
@@ -10074,7 +10061,7 @@
       <w:pPr>
         <w:pStyle w:val="Heading2"/>
       </w:pPr>
-      <w:bookmarkStart w:id="40" w:name="_Toc239437930"/>
+      <w:bookmarkStart w:id="40" w:name="_Toc239441173"/>
       <w:r>
         <w:t>7.1 Anatomía de una tarjeta</w:t>
       </w:r>
@@ -10092,7 +10079,7 @@
       <w:pPr>
         <w:pStyle w:val="Heading2"/>
       </w:pPr>
-      <w:bookmarkStart w:id="41" w:name="_Toc239437931"/>
+      <w:bookmarkStart w:id="41" w:name="_Toc239441174"/>
       <w:r>
         <w:t>7.2 Acciones</w:t>
       </w:r>
@@ -10369,9 +10356,8 @@
       <w:pPr>
         <w:pStyle w:val="Heading1"/>
       </w:pPr>
-      <w:bookmarkStart w:id="42" w:name="_Toc239437932"/>
-      <w:r>
-        <w:lastRenderedPageBreak/>
+      <w:bookmarkStart w:id="42" w:name="_Toc239441175"/>
+      <w:r>
         <w:t>8. Reportes y digest semanal</w:t>
       </w:r>
       <w:bookmarkEnd w:id="42"/>
@@ -10380,7 +10366,7 @@
       <w:pPr>
         <w:pStyle w:val="Heading2"/>
       </w:pPr>
-      <w:bookmarkStart w:id="43" w:name="_Toc239437933"/>
+      <w:bookmarkStart w:id="43" w:name="_Toc239441176"/>
       <w:r>
         <w:t>8.1 Qué contiene el digest</w:t>
       </w:r>
@@ -10530,7 +10516,7 @@
       <w:pPr>
         <w:pStyle w:val="Heading2"/>
       </w:pPr>
-      <w:bookmarkStart w:id="44" w:name="_Toc239437934"/>
+      <w:bookmarkStart w:id="44" w:name="_Toc239441177"/>
       <w:r>
         <w:t>8.2 Generar y enviar</w:t>
       </w:r>
@@ -10600,7 +10586,7 @@
       <w:pPr>
         <w:pStyle w:val="Heading2"/>
       </w:pPr>
-      <w:bookmarkStart w:id="45" w:name="_Toc239437935"/>
+      <w:bookmarkStart w:id="45" w:name="_Toc239441178"/>
       <w:r>
         <w:t>8.3 Configuración del digest</w:t>
       </w:r>
@@ -10618,7 +10604,7 @@
       <w:pPr>
         <w:pStyle w:val="Heading2"/>
       </w:pPr>
-      <w:bookmarkStart w:id="46" w:name="_Toc239437936"/>
+      <w:bookmarkStart w:id="46" w:name="_Toc239441179"/>
       <w:r>
         <w:t>8.4 Exportación a Google Sheets</w:t>
       </w:r>
@@ -10629,7 +10615,6 @@
         <w:spacing w:after="120" w:line="300" w:lineRule="auto"/>
       </w:pPr>
       <w:r>
-        <w:lastRenderedPageBreak/>
         <w:t xml:space="preserve">Reportes → Google Sheets muestra una vista previa de las hojas Pendientes (UUID, clave legada, estado, prioridad, actividad, responsable, área, proyecto, fecha compromiso, reunión origen, última mención, días abierto, vencido) y Reuniones (fecha, reunión, organizador, participantes, resumen, número de acuerdos, número de tareas nuevas, enlace). El botón Sincronizar escribe en la hoja configurada usando el identificador como clave, nunca la posición de fila. Requiere el interruptor "Sincronización Sheets" y </w:t>
       </w:r>
       <w:r>
@@ -10645,9 +10630,8 @@
       <w:pPr>
         <w:pStyle w:val="Heading1"/>
       </w:pPr>
-      <w:bookmarkStart w:id="47" w:name="_Toc239437937"/>
-      <w:r>
-        <w:lastRenderedPageBreak/>
+      <w:bookmarkStart w:id="47" w:name="_Toc239441180"/>
+      <w:r>
         <w:t>9. Configuración y administración funcional</w:t>
       </w:r>
       <w:bookmarkEnd w:id="47"/>
@@ -10656,7 +10640,7 @@
       <w:pPr>
         <w:pStyle w:val="Heading2"/>
       </w:pPr>
-      <w:bookmarkStart w:id="48" w:name="_Toc239437938"/>
+      <w:bookmarkStart w:id="48" w:name="_Toc239441181"/>
       <w:r>
         <w:t>9.1 Equipo</w:t>
       </w:r>
@@ -10674,7 +10658,7 @@
       <w:pPr>
         <w:pStyle w:val="Heading2"/>
       </w:pPr>
-      <w:bookmarkStart w:id="49" w:name="_Toc239437939"/>
+      <w:bookmarkStart w:id="49" w:name="_Toc239441182"/>
       <w:r>
         <w:t>9.2 Administración → Usuarios</w:t>
       </w:r>
@@ -10692,7 +10676,7 @@
       <w:pPr>
         <w:pStyle w:val="Heading2"/>
       </w:pPr>
-      <w:bookmarkStart w:id="50" w:name="_Toc239437940"/>
+      <w:bookmarkStart w:id="50" w:name="_Toc239441183"/>
       <w:r>
         <w:t>9.3 Administración → Catálogos</w:t>
       </w:r>
@@ -10742,7 +10726,7 @@
       <w:pPr>
         <w:pStyle w:val="Heading2"/>
       </w:pPr>
-      <w:bookmarkStart w:id="51" w:name="_Toc239437941"/>
+      <w:bookmarkStart w:id="51" w:name="_Toc239441184"/>
       <w:r>
         <w:t>9.4 Administración → Auditoría</w:t>
       </w:r>
@@ -10760,7 +10744,7 @@
       <w:pPr>
         <w:pStyle w:val="Heading2"/>
       </w:pPr>
-      <w:bookmarkStart w:id="52" w:name="_Toc239437942"/>
+      <w:bookmarkStart w:id="52" w:name="_Toc239441185"/>
       <w:r>
         <w:t>9.5 Administración → Jobs</w:t>
       </w:r>
@@ -10778,7 +10762,7 @@
       <w:pPr>
         <w:pStyle w:val="Heading2"/>
       </w:pPr>
-      <w:bookmarkStart w:id="53" w:name="_Toc239437943"/>
+      <w:bookmarkStart w:id="53" w:name="_Toc239441186"/>
       <w:r>
         <w:t>9.6 Configuración</w:t>
       </w:r>
@@ -11232,7 +11216,6 @@
                 <w:sz w:val="19"/>
                 <w:szCs w:val="19"/>
               </w:rPr>
-              <w:lastRenderedPageBreak/>
               <w:t>Notificaciones Gmail</w:t>
             </w:r>
           </w:p>
@@ -11854,7 +11837,7 @@
       <w:pPr>
         <w:pStyle w:val="Heading2"/>
       </w:pPr>
-      <w:bookmarkStart w:id="54" w:name="_Toc239437944"/>
+      <w:bookmarkStart w:id="54" w:name="_Toc239441187"/>
       <w:r>
         <w:t>9.7 Integraciones</w:t>
       </w:r>
@@ -11877,9 +11860,8 @@
       <w:pPr>
         <w:pStyle w:val="Heading1"/>
       </w:pPr>
-      <w:bookmarkStart w:id="55" w:name="_Toc239437945"/>
-      <w:r>
-        <w:lastRenderedPageBreak/>
+      <w:bookmarkStart w:id="55" w:name="_Toc239441188"/>
+      <w:r>
         <w:t>10. Instalación y operación técnica</w:t>
       </w:r>
       <w:bookmarkEnd w:id="55"/>
@@ -11888,7 +11870,7 @@
       <w:pPr>
         <w:pStyle w:val="Heading2"/>
       </w:pPr>
-      <w:bookmarkStart w:id="56" w:name="_Toc239437946"/>
+      <w:bookmarkStart w:id="56" w:name="_Toc239441189"/>
       <w:r>
         <w:t>10.1 Arquitectura en una página</w:t>
       </w:r>
@@ -12376,7 +12358,7 @@
       <w:pPr>
         <w:pStyle w:val="Heading2"/>
       </w:pPr>
-      <w:bookmarkStart w:id="57" w:name="_Toc239437947"/>
+      <w:bookmarkStart w:id="57" w:name="_Toc239441190"/>
       <w:r>
         <w:t>10.2 Desplegar una nueva versión</w:t>
       </w:r>
@@ -12438,7 +12420,7 @@
       <w:pPr>
         <w:pStyle w:val="Heading2"/>
       </w:pPr>
-      <w:bookmarkStart w:id="58" w:name="_Toc239437948"/>
+      <w:bookmarkStart w:id="58" w:name="_Toc239441191"/>
       <w:r>
         <w:t>10.3 Variables de entorno en Dokploy</w:t>
       </w:r>
@@ -12726,7 +12708,6 @@
                 <w:sz w:val="19"/>
                 <w:szCs w:val="19"/>
               </w:rPr>
-              <w:lastRenderedPageBreak/>
               <w:t>GOOGLE_OAUTH_CLIENT_ID / GOOGLE_OAUTH_CLIENT_SECRET</w:t>
             </w:r>
           </w:p>
@@ -13089,7 +13070,7 @@
       <w:pPr>
         <w:pStyle w:val="Heading2"/>
       </w:pPr>
-      <w:bookmarkStart w:id="59" w:name="_Toc239437949"/>
+      <w:bookmarkStart w:id="59" w:name="_Toc239441192"/>
       <w:r>
         <w:t>10.4 Terminal de un contenedor</w:t>
       </w:r>
@@ -13139,7 +13120,7 @@
       <w:pPr>
         <w:pStyle w:val="Heading2"/>
       </w:pPr>
-      <w:bookmarkStart w:id="60" w:name="_Toc239437950"/>
+      <w:bookmarkStart w:id="60" w:name="_Toc239441193"/>
       <w:r>
         <w:t>10.5 Logs y monitoreo</w:t>
       </w:r>
@@ -13157,7 +13138,7 @@
       <w:pPr>
         <w:pStyle w:val="Heading2"/>
       </w:pPr>
-      <w:bookmarkStart w:id="61" w:name="_Toc239437951"/>
+      <w:bookmarkStart w:id="61" w:name="_Toc239441194"/>
       <w:r>
         <w:t>10.6 Respaldos</w:t>
       </w:r>
@@ -13193,7 +13174,7 @@
       <w:pPr>
         <w:pStyle w:val="Heading2"/>
       </w:pPr>
-      <w:bookmarkStart w:id="62" w:name="_Toc239437952"/>
+      <w:bookmarkStart w:id="62" w:name="_Toc239441195"/>
       <w:r>
         <w:t>10.7 Cambiar al dominio definitivo</w:t>
       </w:r>
@@ -13235,7 +13216,6 @@
         <w:spacing w:after="80" w:line="300" w:lineRule="auto"/>
       </w:pPr>
       <w:r>
-        <w:lastRenderedPageBreak/>
         <w:t>Actualizar APP_URL en Environment.</w:t>
       </w:r>
     </w:p>
@@ -13274,9 +13254,8 @@
       <w:pPr>
         <w:pStyle w:val="Heading1"/>
       </w:pPr>
-      <w:bookmarkStart w:id="63" w:name="_Toc239437953"/>
-      <w:r>
-        <w:lastRenderedPageBreak/>
+      <w:bookmarkStart w:id="63" w:name="_Toc239441196"/>
+      <w:r>
         <w:t>11. Activar las integraciones reales de Google</w:t>
       </w:r>
       <w:bookmarkEnd w:id="63"/>
@@ -13293,7 +13272,7 @@
       <w:pPr>
         <w:pStyle w:val="Heading2"/>
       </w:pPr>
-      <w:bookmarkStart w:id="64" w:name="_Toc239437954"/>
+      <w:bookmarkStart w:id="64" w:name="_Toc239441197"/>
       <w:r>
         <w:t>11.1 Requisitos</w:t>
       </w:r>
@@ -13342,7 +13321,7 @@
       <w:pPr>
         <w:pStyle w:val="Heading2"/>
       </w:pPr>
-      <w:bookmarkStart w:id="65" w:name="_Toc239437955"/>
+      <w:bookmarkStart w:id="65" w:name="_Toc239441198"/>
       <w:r>
         <w:t>11.2 Pasos</w:t>
       </w:r>
@@ -13464,7 +13443,7 @@
       <w:pPr>
         <w:pStyle w:val="Heading2"/>
       </w:pPr>
-      <w:bookmarkStart w:id="66" w:name="_Toc239437956"/>
+      <w:bookmarkStart w:id="66" w:name="_Toc239441199"/>
       <w:r>
         <w:t>11.3 Renovación de suscripciones</w:t>
       </w:r>
@@ -13475,7 +13454,6 @@
         <w:spacing w:after="120" w:line="300" w:lineRule="auto"/>
       </w:pPr>
       <w:r>
-        <w:lastRenderedPageBreak/>
         <w:t>Las suscripciones de Workspace Events caducan; el worker las renueva a diario cuando faltan menos de 48 horas. Si en Integraciones aparece alguna en estado Expirada o Error, pulsa Sincronizar suscripciones y revisa el código de error.</w:t>
       </w:r>
     </w:p>
@@ -13488,9 +13466,8 @@
       <w:pPr>
         <w:pStyle w:val="Heading1"/>
       </w:pPr>
-      <w:bookmarkStart w:id="67" w:name="_Toc239437957"/>
-      <w:r>
-        <w:lastRenderedPageBreak/>
+      <w:bookmarkStart w:id="67" w:name="_Toc239441200"/>
+      <w:r>
         <w:t>12. Importar el Maestro de Tareas (Excel legado)</w:t>
       </w:r>
       <w:bookmarkEnd w:id="67"/>
@@ -13507,7 +13484,7 @@
       <w:pPr>
         <w:pStyle w:val="Heading2"/>
       </w:pPr>
-      <w:bookmarkStart w:id="68" w:name="_Toc239437958"/>
+      <w:bookmarkStart w:id="68" w:name="_Toc239441201"/>
       <w:r>
         <w:t>12.1 Qué hace con cada columna</w:t>
       </w:r>
@@ -14203,7 +14180,7 @@
       <w:pPr>
         <w:pStyle w:val="Heading2"/>
       </w:pPr>
-      <w:bookmarkStart w:id="69" w:name="_Toc239437959"/>
+      <w:bookmarkStart w:id="69" w:name="_Toc239441202"/>
       <w:r>
         <w:t>12.2 Ejecución</w:t>
       </w:r>
@@ -14269,9 +14246,8 @@
       <w:pPr>
         <w:pStyle w:val="Heading1"/>
       </w:pPr>
-      <w:bookmarkStart w:id="70" w:name="_Toc239437960"/>
-      <w:r>
-        <w:lastRenderedPageBreak/>
+      <w:bookmarkStart w:id="70" w:name="_Toc239441203"/>
+      <w:r>
         <w:t>13. Solución de problemas</w:t>
       </w:r>
       <w:bookmarkEnd w:id="70"/>
@@ -15170,9 +15146,8 @@
       <w:pPr>
         <w:pStyle w:val="Heading1"/>
       </w:pPr>
-      <w:bookmarkStart w:id="71" w:name="_Toc239437961"/>
-      <w:r>
-        <w:lastRenderedPageBreak/>
+      <w:bookmarkStart w:id="71" w:name="_Toc239441204"/>
+      <w:r>
         <w:t>14. Glosario</w:t>
       </w:r>
       <w:bookmarkEnd w:id="71"/>
@@ -15867,7 +15842,7 @@
       <w:pPr>
         <w:pStyle w:val="Heading1"/>
       </w:pPr>
-      <w:bookmarkStart w:id="72" w:name="_Toc239437962"/>
+      <w:bookmarkStart w:id="72" w:name="_Toc239441205"/>
       <w:r>
         <w:t>15. Lista de verificación para la puesta en marcha</w:t>
       </w:r>
@@ -16130,10 +16105,96 @@
 <file path=word/numbering.xml><?xml version="1.0" encoding="utf-8"?>
 <w:numbering xmlns:wpc="http://schemas.microsoft.com/office/word/2010/wordprocessingCanvas" xmlns:cx="http://schemas.microsoft.com/office/drawing/2014/chartex" xmlns:cx1="http://schemas.microsoft.com/office/drawing/2015/9/8/chartex" xmlns:cx2="http://schemas.microsoft.com/office/drawing/2015/10/21/chartex" xmlns:cx3="http://schemas.microsoft.com/office/drawing/2016/5/9/chartex" xmlns:cx4="http://schemas.microsoft.com/office/drawing/2016/5/10/chartex" xmlns:cx5="http://schemas.microsoft.com/office/drawing/2016/5/11/chartex" xmlns:cx6="http://schemas.microsoft.com/office/drawing/2016/5/12/chartex" xmlns:cx7="http://schemas.microsoft.com/office/drawing/2016/5/13/chartex" xmlns:cx8="http://schemas.microsoft.com/office/drawing/2016/5/14/chartex" xmlns:mc="http://schemas.openxmlformats.org/markup-compatibility/2006" xmlns:aink="http://schemas.microsoft.com/office/drawing/2016/ink" xmlns:am3d="http://schemas.microsoft.com/office/drawing/2017/model3d" xmlns:o="urn:schemas-microsoft-com:office:office" xmlns:oel="http://schemas.microsoft.com/office/2019/extlst" xmlns:r="http://schemas.openxmlformats.org/officeDocument/2006/relationships" xmlns:m="http://schemas.openxmlformats.org/officeDocument/2006/math" xmlns:v="urn:schemas-microsoft-com:vml" xmlns:wp14="http://schemas.microsoft.com/office/word/2010/wordprocessingDrawing" xmlns:wp="http://schemas.openxmlformats.org/drawingml/2006/wordprocessingDrawing" xmlns:w10="urn:schemas-microsoft-com:office:word" xmlns:w="http://schemas.openxmlformats.org/wordprocessingml/2006/main" xmlns:w14="http://schemas.microsoft.com/office/word/2010/wordml" xmlns:w15="http://schemas.microsoft.com/office/word/2012/wordml" xmlns:w16cex="http://schemas.microsoft.com/office/word/2018/wordml/cex" xmlns:w16cid="http://schemas.microsoft.com/office/word/2016/wordml/cid" xmlns:w16="http://schemas.microsoft.com/office/word/2018/wordml" xmlns:w16du="http://schemas.microsoft.com/office/word/2023/wordml/word16du" xmlns:w16sdtdh="http://schemas.microsoft.com/office/word/2020/wordml/sdtdatahash" xmlns:w16sdtfl="http://schemas.microsoft.com/office/word/2024/wordml/sdtformatlock" xmlns:w16se="http://schemas.microsoft.com/office/word/2015/wordml/symex" xmlns:wpg="http://schemas.microsoft.com/office/word/2010/wordprocessingGroup" xmlns:wpi="http://schemas.microsoft.com/office/word/2010/wordprocessingInk" xmlns:wne="http://schemas.microsoft.com/office/word/2006/wordml" xmlns:wps="http://schemas.microsoft.com/office/word/2010/wordprocessingShape" mc:Ignorable="w14 w15 w16se w16cid w16 w16cex w16sdtdh w16sdtfl w16du wp14">
   <w:abstractNum w:abstractNumId="0" w15:restartNumberingAfterBreak="0">
-    <w:nsid w:val="02AE7880"/>
+    <w:nsid w:val="065F232D"/>
     <w:multiLevelType w:val="hybridMultilevel"/>
-    <w:tmpl w:val="386A8E3E"/>
-    <w:lvl w:ilvl="0" w:tplc="629A2D30">
+    <w:tmpl w:val="352C2DEA"/>
+    <w:lvl w:ilvl="0" w:tplc="DAD224A2">
+      <w:start w:val="1"/>
+      <w:numFmt w:val="bullet"/>
+      <w:lvlText w:val="●"/>
+      <w:lvlJc w:val="left"/>
+      <w:pPr>
+        <w:ind w:left="720" w:hanging="360"/>
+      </w:pPr>
+    </w:lvl>
+    <w:lvl w:ilvl="1" w:tplc="C868BA9A">
+      <w:start w:val="1"/>
+      <w:numFmt w:val="bullet"/>
+      <w:lvlText w:val="○"/>
+      <w:lvlJc w:val="left"/>
+      <w:pPr>
+        <w:ind w:left="1440" w:hanging="360"/>
+      </w:pPr>
+    </w:lvl>
+    <w:lvl w:ilvl="2" w:tplc="21A41088">
+      <w:start w:val="1"/>
+      <w:numFmt w:val="bullet"/>
+      <w:lvlText w:val="■"/>
+      <w:lvlJc w:val="left"/>
+      <w:pPr>
+        <w:ind w:left="2160" w:hanging="360"/>
+      </w:pPr>
+    </w:lvl>
+    <w:lvl w:ilvl="3" w:tplc="909078D0">
+      <w:start w:val="1"/>
+      <w:numFmt w:val="bullet"/>
+      <w:lvlText w:val="●"/>
+      <w:lvlJc w:val="left"/>
+      <w:pPr>
+        <w:ind w:left="2880" w:hanging="360"/>
+      </w:pPr>
+    </w:lvl>
+    <w:lvl w:ilvl="4" w:tplc="3D78A842">
+      <w:start w:val="1"/>
+      <w:numFmt w:val="bullet"/>
+      <w:lvlText w:val="○"/>
+      <w:lvlJc w:val="left"/>
+      <w:pPr>
+        <w:ind w:left="3600" w:hanging="360"/>
+      </w:pPr>
+    </w:lvl>
+    <w:lvl w:ilvl="5" w:tplc="7E7E15AE">
+      <w:start w:val="1"/>
+      <w:numFmt w:val="bullet"/>
+      <w:lvlText w:val="■"/>
+      <w:lvlJc w:val="left"/>
+      <w:pPr>
+        <w:ind w:left="4320" w:hanging="360"/>
+      </w:pPr>
+    </w:lvl>
+    <w:lvl w:ilvl="6" w:tplc="15302E0A">
+      <w:start w:val="1"/>
+      <w:numFmt w:val="bullet"/>
+      <w:lvlText w:val="●"/>
+      <w:lvlJc w:val="left"/>
+      <w:pPr>
+        <w:ind w:left="5040" w:hanging="360"/>
+      </w:pPr>
+    </w:lvl>
+    <w:lvl w:ilvl="7" w:tplc="7F72A958">
+      <w:start w:val="1"/>
+      <w:numFmt w:val="bullet"/>
+      <w:lvlText w:val="●"/>
+      <w:lvlJc w:val="left"/>
+      <w:pPr>
+        <w:ind w:left="5760" w:hanging="360"/>
+      </w:pPr>
+    </w:lvl>
+    <w:lvl w:ilvl="8" w:tplc="1FB4C60C">
+      <w:start w:val="1"/>
+      <w:numFmt w:val="bullet"/>
+      <w:lvlText w:val="●"/>
+      <w:lvlJc w:val="left"/>
+      <w:pPr>
+        <w:ind w:left="6480" w:hanging="360"/>
+      </w:pPr>
+    </w:lvl>
+  </w:abstractNum>
+  <w:abstractNum w:abstractNumId="1" w15:restartNumberingAfterBreak="0">
+    <w:nsid w:val="1CD2620A"/>
+    <w:multiLevelType w:val="hybridMultilevel"/>
+    <w:tmpl w:val="BCB6391C"/>
+    <w:lvl w:ilvl="0" w:tplc="45F4031E">
       <w:start w:val="1"/>
       <w:numFmt w:val="decimal"/>
       <w:lvlText w:val="%1."/>
@@ -16142,106 +16203,52 @@
         <w:ind w:left="540" w:hanging="360"/>
       </w:pPr>
     </w:lvl>
-    <w:lvl w:ilvl="1" w:tplc="102CC886">
+    <w:lvl w:ilvl="1" w:tplc="F2B22DEA">
       <w:numFmt w:val="decimal"/>
       <w:lvlText w:val=""/>
       <w:lvlJc w:val="left"/>
     </w:lvl>
-    <w:lvl w:ilvl="2" w:tplc="762E5C92">
+    <w:lvl w:ilvl="2" w:tplc="C2721C84">
       <w:numFmt w:val="decimal"/>
       <w:lvlText w:val=""/>
       <w:lvlJc w:val="left"/>
     </w:lvl>
-    <w:lvl w:ilvl="3" w:tplc="BB066150">
+    <w:lvl w:ilvl="3" w:tplc="360CC970">
       <w:numFmt w:val="decimal"/>
       <w:lvlText w:val=""/>
       <w:lvlJc w:val="left"/>
     </w:lvl>
-    <w:lvl w:ilvl="4" w:tplc="D0AAB55A">
+    <w:lvl w:ilvl="4" w:tplc="669CFE7A">
       <w:numFmt w:val="decimal"/>
       <w:lvlText w:val=""/>
       <w:lvlJc w:val="left"/>
     </w:lvl>
-    <w:lvl w:ilvl="5" w:tplc="B50C2EF8">
+    <w:lvl w:ilvl="5" w:tplc="22CA212E">
       <w:numFmt w:val="decimal"/>
       <w:lvlText w:val=""/>
       <w:lvlJc w:val="left"/>
     </w:lvl>
-    <w:lvl w:ilvl="6" w:tplc="5410706E">
+    <w:lvl w:ilvl="6" w:tplc="6D3028B6">
       <w:numFmt w:val="decimal"/>
       <w:lvlText w:val=""/>
       <w:lvlJc w:val="left"/>
     </w:lvl>
-    <w:lvl w:ilvl="7" w:tplc="89EED438">
+    <w:lvl w:ilvl="7" w:tplc="36A4C0B6">
       <w:numFmt w:val="decimal"/>
       <w:lvlText w:val=""/>
       <w:lvlJc w:val="left"/>
     </w:lvl>
-    <w:lvl w:ilvl="8" w:tplc="0C78A064">
-      <w:numFmt w:val="decimal"/>
-      <w:lvlText w:val=""/>
-      <w:lvlJc w:val="left"/>
-    </w:lvl>
-  </w:abstractNum>
-  <w:abstractNum w:abstractNumId="1" w15:restartNumberingAfterBreak="0">
-    <w:nsid w:val="0EAF7668"/>
-    <w:multiLevelType w:val="hybridMultilevel"/>
-    <w:tmpl w:val="6AB41D1E"/>
-    <w:lvl w:ilvl="0" w:tplc="5CDAB56A">
-      <w:start w:val="1"/>
-      <w:numFmt w:val="decimal"/>
-      <w:lvlText w:val="%1."/>
-      <w:lvlJc w:val="left"/>
-      <w:pPr>
-        <w:ind w:left="540" w:hanging="360"/>
-      </w:pPr>
-    </w:lvl>
-    <w:lvl w:ilvl="1" w:tplc="5B44B782">
-      <w:numFmt w:val="decimal"/>
-      <w:lvlText w:val=""/>
-      <w:lvlJc w:val="left"/>
-    </w:lvl>
-    <w:lvl w:ilvl="2" w:tplc="AA40FB7A">
-      <w:numFmt w:val="decimal"/>
-      <w:lvlText w:val=""/>
-      <w:lvlJc w:val="left"/>
-    </w:lvl>
-    <w:lvl w:ilvl="3" w:tplc="1DA80424">
-      <w:numFmt w:val="decimal"/>
-      <w:lvlText w:val=""/>
-      <w:lvlJc w:val="left"/>
-    </w:lvl>
-    <w:lvl w:ilvl="4" w:tplc="12FCD3B4">
-      <w:numFmt w:val="decimal"/>
-      <w:lvlText w:val=""/>
-      <w:lvlJc w:val="left"/>
-    </w:lvl>
-    <w:lvl w:ilvl="5" w:tplc="40263F10">
-      <w:numFmt w:val="decimal"/>
-      <w:lvlText w:val=""/>
-      <w:lvlJc w:val="left"/>
-    </w:lvl>
-    <w:lvl w:ilvl="6" w:tplc="C1CADC3E">
-      <w:numFmt w:val="decimal"/>
-      <w:lvlText w:val=""/>
-      <w:lvlJc w:val="left"/>
-    </w:lvl>
-    <w:lvl w:ilvl="7" w:tplc="D1C8745A">
-      <w:numFmt w:val="decimal"/>
-      <w:lvlText w:val=""/>
-      <w:lvlJc w:val="left"/>
-    </w:lvl>
-    <w:lvl w:ilvl="8" w:tplc="1E5CF618">
+    <w:lvl w:ilvl="8" w:tplc="A87AE526">
       <w:numFmt w:val="decimal"/>
       <w:lvlText w:val=""/>
       <w:lvlJc w:val="left"/>
     </w:lvl>
   </w:abstractNum>
   <w:abstractNum w:abstractNumId="2" w15:restartNumberingAfterBreak="0">
-    <w:nsid w:val="667C6897"/>
+    <w:nsid w:val="2CC536F0"/>
     <w:multiLevelType w:val="hybridMultilevel"/>
-    <w:tmpl w:val="8EFA85EE"/>
-    <w:lvl w:ilvl="0" w:tplc="643A9A02">
+    <w:tmpl w:val="C3C878A2"/>
+    <w:lvl w:ilvl="0" w:tplc="5A2A64E6">
       <w:start w:val="1"/>
       <w:numFmt w:val="decimal"/>
       <w:lvlText w:val="%1."/>
@@ -16250,52 +16257,52 @@
         <w:ind w:left="540" w:hanging="360"/>
       </w:pPr>
     </w:lvl>
-    <w:lvl w:ilvl="1" w:tplc="CD0839F6">
+    <w:lvl w:ilvl="1" w:tplc="33FA4C70">
       <w:numFmt w:val="decimal"/>
       <w:lvlText w:val=""/>
       <w:lvlJc w:val="left"/>
     </w:lvl>
-    <w:lvl w:ilvl="2" w:tplc="FA1CA30C">
+    <w:lvl w:ilvl="2" w:tplc="BB6EE0C0">
       <w:numFmt w:val="decimal"/>
       <w:lvlText w:val=""/>
       <w:lvlJc w:val="left"/>
     </w:lvl>
-    <w:lvl w:ilvl="3" w:tplc="AEF47178">
+    <w:lvl w:ilvl="3" w:tplc="B9929DE6">
       <w:numFmt w:val="decimal"/>
       <w:lvlText w:val=""/>
       <w:lvlJc w:val="left"/>
     </w:lvl>
-    <w:lvl w:ilvl="4" w:tplc="77BA928E">
+    <w:lvl w:ilvl="4" w:tplc="EEF83A50">
       <w:numFmt w:val="decimal"/>
       <w:lvlText w:val=""/>
       <w:lvlJc w:val="left"/>
     </w:lvl>
-    <w:lvl w:ilvl="5" w:tplc="DD361C9E">
+    <w:lvl w:ilvl="5" w:tplc="6C64D60A">
       <w:numFmt w:val="decimal"/>
       <w:lvlText w:val=""/>
       <w:lvlJc w:val="left"/>
     </w:lvl>
-    <w:lvl w:ilvl="6" w:tplc="3FD41CD6">
+    <w:lvl w:ilvl="6" w:tplc="FE8CFA8A">
       <w:numFmt w:val="decimal"/>
       <w:lvlText w:val=""/>
       <w:lvlJc w:val="left"/>
     </w:lvl>
-    <w:lvl w:ilvl="7" w:tplc="82CC3116">
+    <w:lvl w:ilvl="7" w:tplc="363AAD1E">
       <w:numFmt w:val="decimal"/>
       <w:lvlText w:val=""/>
       <w:lvlJc w:val="left"/>
     </w:lvl>
-    <w:lvl w:ilvl="8" w:tplc="88E2B31E">
+    <w:lvl w:ilvl="8" w:tplc="EC9A76DE">
       <w:numFmt w:val="decimal"/>
       <w:lvlText w:val=""/>
       <w:lvlJc w:val="left"/>
     </w:lvl>
   </w:abstractNum>
   <w:abstractNum w:abstractNumId="3" w15:restartNumberingAfterBreak="0">
-    <w:nsid w:val="68694A4B"/>
+    <w:nsid w:val="3BDB0008"/>
     <w:multiLevelType w:val="hybridMultilevel"/>
-    <w:tmpl w:val="E26CDE24"/>
-    <w:lvl w:ilvl="0" w:tplc="92BA4BD2">
+    <w:tmpl w:val="A2BC81C0"/>
+    <w:lvl w:ilvl="0" w:tplc="263E7FB4">
       <w:start w:val="1"/>
       <w:numFmt w:val="decimal"/>
       <w:lvlText w:val="%1."/>
@@ -16304,110 +16311,106 @@
         <w:ind w:left="540" w:hanging="360"/>
       </w:pPr>
     </w:lvl>
-    <w:lvl w:ilvl="1" w:tplc="34CC04F8">
+    <w:lvl w:ilvl="1" w:tplc="7C9E561C">
       <w:numFmt w:val="decimal"/>
       <w:lvlText w:val=""/>
       <w:lvlJc w:val="left"/>
     </w:lvl>
-    <w:lvl w:ilvl="2" w:tplc="F26A6E06">
+    <w:lvl w:ilvl="2" w:tplc="053C21FC">
       <w:numFmt w:val="decimal"/>
       <w:lvlText w:val=""/>
       <w:lvlJc w:val="left"/>
     </w:lvl>
-    <w:lvl w:ilvl="3" w:tplc="6C28CE52">
+    <w:lvl w:ilvl="3" w:tplc="2F121592">
       <w:numFmt w:val="decimal"/>
       <w:lvlText w:val=""/>
       <w:lvlJc w:val="left"/>
     </w:lvl>
-    <w:lvl w:ilvl="4" w:tplc="AE801602">
+    <w:lvl w:ilvl="4" w:tplc="036A5CF4">
       <w:numFmt w:val="decimal"/>
       <w:lvlText w:val=""/>
       <w:lvlJc w:val="left"/>
     </w:lvl>
-    <w:lvl w:ilvl="5" w:tplc="C1DEF402">
+    <w:lvl w:ilvl="5" w:tplc="595226D6">
       <w:numFmt w:val="decimal"/>
       <w:lvlText w:val=""/>
       <w:lvlJc w:val="left"/>
     </w:lvl>
-    <w:lvl w:ilvl="6" w:tplc="A3988CBA">
+    <w:lvl w:ilvl="6" w:tplc="3DB01578">
       <w:numFmt w:val="decimal"/>
       <w:lvlText w:val=""/>
       <w:lvlJc w:val="left"/>
     </w:lvl>
-    <w:lvl w:ilvl="7" w:tplc="4FF8303C">
+    <w:lvl w:ilvl="7" w:tplc="0026EA24">
       <w:numFmt w:val="decimal"/>
       <w:lvlText w:val=""/>
       <w:lvlJc w:val="left"/>
     </w:lvl>
-    <w:lvl w:ilvl="8" w:tplc="F6105908">
+    <w:lvl w:ilvl="8" w:tplc="E7BA5AE6">
       <w:numFmt w:val="decimal"/>
       <w:lvlText w:val=""/>
       <w:lvlJc w:val="left"/>
     </w:lvl>
   </w:abstractNum>
   <w:abstractNum w:abstractNumId="4" w15:restartNumberingAfterBreak="0">
-    <w:nsid w:val="6A157D96"/>
+    <w:nsid w:val="3D8B4C15"/>
     <w:multiLevelType w:val="hybridMultilevel"/>
-    <w:tmpl w:val="6CB86BEA"/>
-    <w:lvl w:ilvl="0" w:tplc="46AA7EB0">
+    <w:tmpl w:val="EF02A09A"/>
+    <w:lvl w:ilvl="0" w:tplc="CB8A0678">
       <w:start w:val="1"/>
-      <w:numFmt w:val="bullet"/>
-      <w:lvlText w:val="•"/>
+      <w:numFmt w:val="decimal"/>
+      <w:lvlText w:val="%1."/>
       <w:lvlJc w:val="left"/>
       <w:pPr>
-        <w:ind w:left="540" w:hanging="270"/>
+        <w:ind w:left="540" w:hanging="360"/>
       </w:pPr>
     </w:lvl>
-    <w:lvl w:ilvl="1" w:tplc="9C420D98">
-      <w:start w:val="1"/>
-      <w:numFmt w:val="bullet"/>
-      <w:lvlText w:val="–"/>
-      <w:lvlJc w:val="left"/>
-      <w:pPr>
-        <w:ind w:left="1080" w:hanging="270"/>
-      </w:pPr>
-    </w:lvl>
-    <w:lvl w:ilvl="2" w:tplc="EBD4B22E">
+    <w:lvl w:ilvl="1" w:tplc="6DE2EC94">
       <w:numFmt w:val="decimal"/>
       <w:lvlText w:val=""/>
       <w:lvlJc w:val="left"/>
     </w:lvl>
-    <w:lvl w:ilvl="3" w:tplc="315ACCAE">
+    <w:lvl w:ilvl="2" w:tplc="6EDC4C6E">
       <w:numFmt w:val="decimal"/>
       <w:lvlText w:val=""/>
       <w:lvlJc w:val="left"/>
     </w:lvl>
-    <w:lvl w:ilvl="4" w:tplc="CF34874A">
+    <w:lvl w:ilvl="3" w:tplc="8ABA7CBE">
       <w:numFmt w:val="decimal"/>
       <w:lvlText w:val=""/>
       <w:lvlJc w:val="left"/>
     </w:lvl>
-    <w:lvl w:ilvl="5" w:tplc="AC40AB8E">
+    <w:lvl w:ilvl="4" w:tplc="FAD21290">
       <w:numFmt w:val="decimal"/>
       <w:lvlText w:val=""/>
       <w:lvlJc w:val="left"/>
     </w:lvl>
-    <w:lvl w:ilvl="6" w:tplc="EEA036B6">
+    <w:lvl w:ilvl="5" w:tplc="60AC269E">
       <w:numFmt w:val="decimal"/>
       <w:lvlText w:val=""/>
       <w:lvlJc w:val="left"/>
     </w:lvl>
-    <w:lvl w:ilvl="7" w:tplc="706C4E3E">
+    <w:lvl w:ilvl="6" w:tplc="CD2CC092">
       <w:numFmt w:val="decimal"/>
       <w:lvlText w:val=""/>
       <w:lvlJc w:val="left"/>
     </w:lvl>
-    <w:lvl w:ilvl="8" w:tplc="32B6CDD4">
+    <w:lvl w:ilvl="7" w:tplc="561245BC">
+      <w:numFmt w:val="decimal"/>
+      <w:lvlText w:val=""/>
+      <w:lvlJc w:val="left"/>
+    </w:lvl>
+    <w:lvl w:ilvl="8" w:tplc="A698C7F6">
       <w:numFmt w:val="decimal"/>
       <w:lvlText w:val=""/>
       <w:lvlJc w:val="left"/>
     </w:lvl>
   </w:abstractNum>
   <w:abstractNum w:abstractNumId="5" w15:restartNumberingAfterBreak="0">
-    <w:nsid w:val="6DC72A4A"/>
+    <w:nsid w:val="41342E7D"/>
     <w:multiLevelType w:val="hybridMultilevel"/>
-    <w:tmpl w:val="0D54A52E"/>
-    <w:lvl w:ilvl="0" w:tplc="7F488C4A">
+    <w:tmpl w:val="6E681B90"/>
+    <w:lvl w:ilvl="0" w:tplc="D34EEC32">
       <w:start w:val="1"/>
       <w:numFmt w:val="decimal"/>
       <w:lvlText w:val="%1."/>
@@ -16416,138 +16419,52 @@
         <w:ind w:left="540" w:hanging="360"/>
       </w:pPr>
     </w:lvl>
-    <w:lvl w:ilvl="1" w:tplc="9F12E90A">
+    <w:lvl w:ilvl="1" w:tplc="EB74737A">
       <w:numFmt w:val="decimal"/>
       <w:lvlText w:val=""/>
       <w:lvlJc w:val="left"/>
     </w:lvl>
-    <w:lvl w:ilvl="2" w:tplc="AC3C0102">
+    <w:lvl w:ilvl="2" w:tplc="84A676D2">
       <w:numFmt w:val="decimal"/>
       <w:lvlText w:val=""/>
       <w:lvlJc w:val="left"/>
     </w:lvl>
-    <w:lvl w:ilvl="3" w:tplc="EF94A806">
+    <w:lvl w:ilvl="3" w:tplc="E7FAE7BE">
       <w:numFmt w:val="decimal"/>
       <w:lvlText w:val=""/>
       <w:lvlJc w:val="left"/>
     </w:lvl>
-    <w:lvl w:ilvl="4" w:tplc="9DEE2B30">
+    <w:lvl w:ilvl="4" w:tplc="F806C49A">
       <w:numFmt w:val="decimal"/>
       <w:lvlText w:val=""/>
       <w:lvlJc w:val="left"/>
     </w:lvl>
-    <w:lvl w:ilvl="5" w:tplc="5FCA678A">
+    <w:lvl w:ilvl="5" w:tplc="FB00B11A">
       <w:numFmt w:val="decimal"/>
       <w:lvlText w:val=""/>
       <w:lvlJc w:val="left"/>
     </w:lvl>
-    <w:lvl w:ilvl="6" w:tplc="872AC77A">
+    <w:lvl w:ilvl="6" w:tplc="CEE259BC">
       <w:numFmt w:val="decimal"/>
       <w:lvlText w:val=""/>
       <w:lvlJc w:val="left"/>
     </w:lvl>
-    <w:lvl w:ilvl="7" w:tplc="0D20C306">
+    <w:lvl w:ilvl="7" w:tplc="F418C464">
       <w:numFmt w:val="decimal"/>
       <w:lvlText w:val=""/>
       <w:lvlJc w:val="left"/>
     </w:lvl>
-    <w:lvl w:ilvl="8" w:tplc="75C0CD14">
+    <w:lvl w:ilvl="8" w:tplc="A184CAF4">
       <w:numFmt w:val="decimal"/>
       <w:lvlText w:val=""/>
       <w:lvlJc w:val="left"/>
     </w:lvl>
   </w:abstractNum>
   <w:abstractNum w:abstractNumId="6" w15:restartNumberingAfterBreak="0">
-    <w:nsid w:val="6F1C4941"/>
+    <w:nsid w:val="42E33FED"/>
     <w:multiLevelType w:val="hybridMultilevel"/>
-    <w:tmpl w:val="B8AE941C"/>
-    <w:lvl w:ilvl="0" w:tplc="6C5C9D06">
-      <w:start w:val="1"/>
-      <w:numFmt w:val="bullet"/>
-      <w:lvlText w:val="●"/>
-      <w:lvlJc w:val="left"/>
-      <w:pPr>
-        <w:ind w:left="720" w:hanging="360"/>
-      </w:pPr>
-    </w:lvl>
-    <w:lvl w:ilvl="1" w:tplc="7820E2CE">
-      <w:start w:val="1"/>
-      <w:numFmt w:val="bullet"/>
-      <w:lvlText w:val="○"/>
-      <w:lvlJc w:val="left"/>
-      <w:pPr>
-        <w:ind w:left="1440" w:hanging="360"/>
-      </w:pPr>
-    </w:lvl>
-    <w:lvl w:ilvl="2" w:tplc="8FF2ADDE">
-      <w:start w:val="1"/>
-      <w:numFmt w:val="bullet"/>
-      <w:lvlText w:val="■"/>
-      <w:lvlJc w:val="left"/>
-      <w:pPr>
-        <w:ind w:left="2160" w:hanging="360"/>
-      </w:pPr>
-    </w:lvl>
-    <w:lvl w:ilvl="3" w:tplc="9E303CDE">
-      <w:start w:val="1"/>
-      <w:numFmt w:val="bullet"/>
-      <w:lvlText w:val="●"/>
-      <w:lvlJc w:val="left"/>
-      <w:pPr>
-        <w:ind w:left="2880" w:hanging="360"/>
-      </w:pPr>
-    </w:lvl>
-    <w:lvl w:ilvl="4" w:tplc="694630FA">
-      <w:start w:val="1"/>
-      <w:numFmt w:val="bullet"/>
-      <w:lvlText w:val="○"/>
-      <w:lvlJc w:val="left"/>
-      <w:pPr>
-        <w:ind w:left="3600" w:hanging="360"/>
-      </w:pPr>
-    </w:lvl>
-    <w:lvl w:ilvl="5" w:tplc="5C34A268">
-      <w:start w:val="1"/>
-      <w:numFmt w:val="bullet"/>
-      <w:lvlText w:val="■"/>
-      <w:lvlJc w:val="left"/>
-      <w:pPr>
-        <w:ind w:left="4320" w:hanging="360"/>
-      </w:pPr>
-    </w:lvl>
-    <w:lvl w:ilvl="6" w:tplc="F09C3DD2">
-      <w:start w:val="1"/>
-      <w:numFmt w:val="bullet"/>
-      <w:lvlText w:val="●"/>
-      <w:lvlJc w:val="left"/>
-      <w:pPr>
-        <w:ind w:left="5040" w:hanging="360"/>
-      </w:pPr>
-    </w:lvl>
-    <w:lvl w:ilvl="7" w:tplc="0A60747A">
-      <w:start w:val="1"/>
-      <w:numFmt w:val="bullet"/>
-      <w:lvlText w:val="●"/>
-      <w:lvlJc w:val="left"/>
-      <w:pPr>
-        <w:ind w:left="5760" w:hanging="360"/>
-      </w:pPr>
-    </w:lvl>
-    <w:lvl w:ilvl="8" w:tplc="ED209F94">
-      <w:start w:val="1"/>
-      <w:numFmt w:val="bullet"/>
-      <w:lvlText w:val="●"/>
-      <w:lvlJc w:val="left"/>
-      <w:pPr>
-        <w:ind w:left="6480" w:hanging="360"/>
-      </w:pPr>
-    </w:lvl>
-  </w:abstractNum>
-  <w:abstractNum w:abstractNumId="7" w15:restartNumberingAfterBreak="0">
-    <w:nsid w:val="71E112D8"/>
-    <w:multiLevelType w:val="hybridMultilevel"/>
-    <w:tmpl w:val="56FC624C"/>
-    <w:lvl w:ilvl="0" w:tplc="5D644F2E">
+    <w:tmpl w:val="3A6CB558"/>
+    <w:lvl w:ilvl="0" w:tplc="6252613E">
       <w:start w:val="1"/>
       <w:numFmt w:val="decimal"/>
       <w:lvlText w:val="%1."/>
@@ -16556,52 +16473,110 @@
         <w:ind w:left="540" w:hanging="360"/>
       </w:pPr>
     </w:lvl>
-    <w:lvl w:ilvl="1" w:tplc="3110BC2C">
+    <w:lvl w:ilvl="1" w:tplc="0EE26ED6">
       <w:numFmt w:val="decimal"/>
       <w:lvlText w:val=""/>
       <w:lvlJc w:val="left"/>
     </w:lvl>
-    <w:lvl w:ilvl="2" w:tplc="75CA3578">
+    <w:lvl w:ilvl="2" w:tplc="76BC80C6">
       <w:numFmt w:val="decimal"/>
       <w:lvlText w:val=""/>
       <w:lvlJc w:val="left"/>
     </w:lvl>
-    <w:lvl w:ilvl="3" w:tplc="B3BCE548">
+    <w:lvl w:ilvl="3" w:tplc="AC3272DC">
       <w:numFmt w:val="decimal"/>
       <w:lvlText w:val=""/>
       <w:lvlJc w:val="left"/>
     </w:lvl>
-    <w:lvl w:ilvl="4" w:tplc="7774FD82">
+    <w:lvl w:ilvl="4" w:tplc="BDB438DA">
       <w:numFmt w:val="decimal"/>
       <w:lvlText w:val=""/>
       <w:lvlJc w:val="left"/>
     </w:lvl>
-    <w:lvl w:ilvl="5" w:tplc="017687A2">
+    <w:lvl w:ilvl="5" w:tplc="83B08458">
       <w:numFmt w:val="decimal"/>
       <w:lvlText w:val=""/>
       <w:lvlJc w:val="left"/>
     </w:lvl>
-    <w:lvl w:ilvl="6" w:tplc="D9005EAC">
+    <w:lvl w:ilvl="6" w:tplc="CAF24B54">
       <w:numFmt w:val="decimal"/>
       <w:lvlText w:val=""/>
       <w:lvlJc w:val="left"/>
     </w:lvl>
-    <w:lvl w:ilvl="7" w:tplc="69B82110">
+    <w:lvl w:ilvl="7" w:tplc="2C7C152E">
       <w:numFmt w:val="decimal"/>
       <w:lvlText w:val=""/>
       <w:lvlJc w:val="left"/>
     </w:lvl>
-    <w:lvl w:ilvl="8" w:tplc="D4682CE0">
+    <w:lvl w:ilvl="8" w:tplc="FCA4DEDC">
+      <w:numFmt w:val="decimal"/>
+      <w:lvlText w:val=""/>
+      <w:lvlJc w:val="left"/>
+    </w:lvl>
+  </w:abstractNum>
+  <w:abstractNum w:abstractNumId="7" w15:restartNumberingAfterBreak="0">
+    <w:nsid w:val="70414D5E"/>
+    <w:multiLevelType w:val="hybridMultilevel"/>
+    <w:tmpl w:val="AD564CFC"/>
+    <w:lvl w:ilvl="0" w:tplc="AFF84B44">
+      <w:start w:val="1"/>
+      <w:numFmt w:val="bullet"/>
+      <w:lvlText w:val="•"/>
+      <w:lvlJc w:val="left"/>
+      <w:pPr>
+        <w:ind w:left="540" w:hanging="270"/>
+      </w:pPr>
+    </w:lvl>
+    <w:lvl w:ilvl="1" w:tplc="F2C647A2">
+      <w:start w:val="1"/>
+      <w:numFmt w:val="bullet"/>
+      <w:lvlText w:val="–"/>
+      <w:lvlJc w:val="left"/>
+      <w:pPr>
+        <w:ind w:left="1080" w:hanging="270"/>
+      </w:pPr>
+    </w:lvl>
+    <w:lvl w:ilvl="2" w:tplc="6100A908">
+      <w:numFmt w:val="decimal"/>
+      <w:lvlText w:val=""/>
+      <w:lvlJc w:val="left"/>
+    </w:lvl>
+    <w:lvl w:ilvl="3" w:tplc="363C12EA">
+      <w:numFmt w:val="decimal"/>
+      <w:lvlText w:val=""/>
+      <w:lvlJc w:val="left"/>
+    </w:lvl>
+    <w:lvl w:ilvl="4" w:tplc="15E8AB46">
+      <w:numFmt w:val="decimal"/>
+      <w:lvlText w:val=""/>
+      <w:lvlJc w:val="left"/>
+    </w:lvl>
+    <w:lvl w:ilvl="5" w:tplc="2A08D8A6">
+      <w:numFmt w:val="decimal"/>
+      <w:lvlText w:val=""/>
+      <w:lvlJc w:val="left"/>
+    </w:lvl>
+    <w:lvl w:ilvl="6" w:tplc="E9948926">
+      <w:numFmt w:val="decimal"/>
+      <w:lvlText w:val=""/>
+      <w:lvlJc w:val="left"/>
+    </w:lvl>
+    <w:lvl w:ilvl="7" w:tplc="EF089E64">
+      <w:numFmt w:val="decimal"/>
+      <w:lvlText w:val=""/>
+      <w:lvlJc w:val="left"/>
+    </w:lvl>
+    <w:lvl w:ilvl="8" w:tplc="EAEAB656">
       <w:numFmt w:val="decimal"/>
       <w:lvlText w:val=""/>
       <w:lvlJc w:val="left"/>
     </w:lvl>
   </w:abstractNum>
   <w:abstractNum w:abstractNumId="8" w15:restartNumberingAfterBreak="0">
-    <w:nsid w:val="7C4C472F"/>
+    <w:nsid w:val="739C0467"/>
     <w:multiLevelType w:val="hybridMultilevel"/>
-    <w:tmpl w:val="2EC6E090"/>
-    <w:lvl w:ilvl="0" w:tplc="9284685E">
+    <w:tmpl w:val="42F652B6"/>
+    <w:lvl w:ilvl="0" w:tplc="A2FACC52">
       <w:start w:val="1"/>
       <w:numFmt w:val="decimal"/>
       <w:lvlText w:val="%1."/>
@@ -16610,97 +16585,97 @@
         <w:ind w:left="540" w:hanging="360"/>
       </w:pPr>
     </w:lvl>
-    <w:lvl w:ilvl="1" w:tplc="524EF536">
+    <w:lvl w:ilvl="1" w:tplc="0054166C">
       <w:numFmt w:val="decimal"/>
       <w:lvlText w:val=""/>
       <w:lvlJc w:val="left"/>
     </w:lvl>
-    <w:lvl w:ilvl="2" w:tplc="DD66124C">
+    <w:lvl w:ilvl="2" w:tplc="7ADE17FC">
       <w:numFmt w:val="decimal"/>
       <w:lvlText w:val=""/>
       <w:lvlJc w:val="left"/>
     </w:lvl>
-    <w:lvl w:ilvl="3" w:tplc="34725906">
+    <w:lvl w:ilvl="3" w:tplc="90626B60">
       <w:numFmt w:val="decimal"/>
       <w:lvlText w:val=""/>
       <w:lvlJc w:val="left"/>
     </w:lvl>
-    <w:lvl w:ilvl="4" w:tplc="C5700CF4">
+    <w:lvl w:ilvl="4" w:tplc="D3AABD74">
       <w:numFmt w:val="decimal"/>
       <w:lvlText w:val=""/>
       <w:lvlJc w:val="left"/>
     </w:lvl>
-    <w:lvl w:ilvl="5" w:tplc="52BC8B50">
+    <w:lvl w:ilvl="5" w:tplc="B6241FCC">
       <w:numFmt w:val="decimal"/>
       <w:lvlText w:val=""/>
       <w:lvlJc w:val="left"/>
     </w:lvl>
-    <w:lvl w:ilvl="6" w:tplc="E6FA8278">
+    <w:lvl w:ilvl="6" w:tplc="30883D32">
       <w:numFmt w:val="decimal"/>
       <w:lvlText w:val=""/>
       <w:lvlJc w:val="left"/>
     </w:lvl>
-    <w:lvl w:ilvl="7" w:tplc="BA52891A">
+    <w:lvl w:ilvl="7" w:tplc="F63AC2B6">
       <w:numFmt w:val="decimal"/>
       <w:lvlText w:val=""/>
       <w:lvlJc w:val="left"/>
     </w:lvl>
-    <w:lvl w:ilvl="8" w:tplc="2E5AB76E">
+    <w:lvl w:ilvl="8" w:tplc="41B047DC">
       <w:numFmt w:val="decimal"/>
       <w:lvlText w:val=""/>
       <w:lvlJc w:val="left"/>
     </w:lvl>
   </w:abstractNum>
-  <w:num w:numId="1" w16cid:durableId="1778677813">
+  <w:num w:numId="1" w16cid:durableId="915359411">
+    <w:abstractNumId w:val="0"/>
+    <w:lvlOverride w:ilvl="0">
+      <w:startOverride w:val="1"/>
+    </w:lvlOverride>
+  </w:num>
+  <w:num w:numId="2" w16cid:durableId="1479111131">
+    <w:abstractNumId w:val="7"/>
+    <w:lvlOverride w:ilvl="0">
+      <w:startOverride w:val="1"/>
+    </w:lvlOverride>
+  </w:num>
+  <w:num w:numId="3" w16cid:durableId="852306023">
+    <w:abstractNumId w:val="5"/>
+    <w:lvlOverride w:ilvl="0">
+      <w:startOverride w:val="1"/>
+    </w:lvlOverride>
+  </w:num>
+  <w:num w:numId="4" w16cid:durableId="1583828421">
     <w:abstractNumId w:val="6"/>
     <w:lvlOverride w:ilvl="0">
       <w:startOverride w:val="1"/>
     </w:lvlOverride>
   </w:num>
-  <w:num w:numId="2" w16cid:durableId="680932605">
+  <w:num w:numId="5" w16cid:durableId="1308509048">
+    <w:abstractNumId w:val="1"/>
+    <w:lvlOverride w:ilvl="0">
+      <w:startOverride w:val="1"/>
+    </w:lvlOverride>
+  </w:num>
+  <w:num w:numId="6" w16cid:durableId="1763646634">
+    <w:abstractNumId w:val="8"/>
+    <w:lvlOverride w:ilvl="0">
+      <w:startOverride w:val="1"/>
+    </w:lvlOverride>
+  </w:num>
+  <w:num w:numId="7" w16cid:durableId="720515789">
     <w:abstractNumId w:val="4"/>
     <w:lvlOverride w:ilvl="0">
       <w:startOverride w:val="1"/>
     </w:lvlOverride>
   </w:num>
-  <w:num w:numId="3" w16cid:durableId="1860046710">
-    <w:abstractNumId w:val="1"/>
-    <w:lvlOverride w:ilvl="0">
-      <w:startOverride w:val="1"/>
-    </w:lvlOverride>
-  </w:num>
-  <w:num w:numId="4" w16cid:durableId="846552625">
-    <w:abstractNumId w:val="5"/>
-    <w:lvlOverride w:ilvl="0">
-      <w:startOverride w:val="1"/>
-    </w:lvlOverride>
-  </w:num>
-  <w:num w:numId="5" w16cid:durableId="1427456848">
+  <w:num w:numId="8" w16cid:durableId="1523934809">
     <w:abstractNumId w:val="2"/>
     <w:lvlOverride w:ilvl="0">
       <w:startOverride w:val="1"/>
     </w:lvlOverride>
   </w:num>
-  <w:num w:numId="6" w16cid:durableId="1377505188">
-    <w:abstractNumId w:val="8"/>
-    <w:lvlOverride w:ilvl="0">
-      <w:startOverride w:val="1"/>
-    </w:lvlOverride>
-  </w:num>
-  <w:num w:numId="7" w16cid:durableId="125973994">
-    <w:abstractNumId w:val="0"/>
-    <w:lvlOverride w:ilvl="0">
-      <w:startOverride w:val="1"/>
-    </w:lvlOverride>
-  </w:num>
-  <w:num w:numId="8" w16cid:durableId="1169101559">
+  <w:num w:numId="9" w16cid:durableId="307251081">
     <w:abstractNumId w:val="3"/>
-    <w:lvlOverride w:ilvl="0">
-      <w:startOverride w:val="1"/>
-    </w:lvlOverride>
-  </w:num>
-  <w:num w:numId="9" w16cid:durableId="1509981705">
-    <w:abstractNumId w:val="7"/>
     <w:lvlOverride w:ilvl="0">
       <w:startOverride w:val="1"/>
     </w:lvlOverride>
@@ -17321,7 +17296,7 @@
     <w:autoRedefine/>
     <w:uiPriority w:val="39"/>
     <w:unhideWhenUsed/>
-    <w:rsid w:val="00E65C28"/>
+    <w:rsid w:val="00763F8D"/>
     <w:pPr>
       <w:spacing w:after="100"/>
     </w:pPr>
@@ -17333,7 +17308,7 @@
     <w:autoRedefine/>
     <w:uiPriority w:val="39"/>
     <w:unhideWhenUsed/>
-    <w:rsid w:val="00E65C28"/>
+    <w:rsid w:val="00763F8D"/>
     <w:pPr>
       <w:spacing w:after="100"/>
       <w:ind w:left="220"/>

</xml_diff>